<commit_message>
we delay if for later
</commit_message>
<xml_diff>
--- a/sem-4/AI403/assign/LOE.docx
+++ b/sem-4/AI403/assign/LOE.docx
@@ -6,14 +6,62 @@
       <w:pPr>
         <w:pStyle w:val="Title"/>
         <w:rPr>
-          <w:lang w:val="en-US"/>
-        </w:rPr>
-      </w:pPr>
-      <w:r>
-        <w:rPr>
+          <w:sz w:val="48"/>
+          <w:szCs w:val="48"/>
+          <w:lang w:val="en-US"/>
+        </w:rPr>
+      </w:pPr>
+      <w:r>
+        <w:rPr>
+          <w:sz w:val="48"/>
+          <w:szCs w:val="48"/>
           <w:lang w:val="en-US"/>
         </w:rPr>
         <w:t>Experiment 1</w:t>
+      </w:r>
+    </w:p>
+    <w:p>
+      <w:pPr>
+        <w:jc w:val="both"/>
+        <w:rPr>
+          <w:b/>
+          <w:bCs/>
+          <w:sz w:val="28"/>
+          <w:szCs w:val="28"/>
+          <w:lang w:val="en-US"/>
+        </w:rPr>
+      </w:pPr>
+      <w:r>
+        <w:rPr>
+          <w:b/>
+          <w:bCs/>
+          <w:sz w:val="28"/>
+          <w:szCs w:val="28"/>
+          <w:lang w:val="en-US"/>
+        </w:rPr>
+        <w:t xml:space="preserve">College a real-life dataset and identify different types of </w:t>
+      </w:r>
+      <w:proofErr w:type="gramStart"/>
+      <w:r>
+        <w:rPr>
+          <w:b/>
+          <w:bCs/>
+          <w:sz w:val="28"/>
+          <w:szCs w:val="28"/>
+          <w:lang w:val="en-US"/>
+        </w:rPr>
+        <w:t>data(</w:t>
+      </w:r>
+      <w:proofErr w:type="gramEnd"/>
+      <w:r>
+        <w:rPr>
+          <w:b/>
+          <w:bCs/>
+          <w:sz w:val="28"/>
+          <w:szCs w:val="28"/>
+          <w:lang w:val="en-US"/>
+        </w:rPr>
+        <w:t>such as numerical and categorical). Analyze the dataset and present it using suitable tables or charts.</w:t>
       </w:r>
     </w:p>
     <w:p>
@@ -27,81 +75,2972 @@
           <w:lang w:val="en-US"/>
         </w:rPr>
       </w:pPr>
+    </w:p>
+    <w:p>
+      <w:pPr>
+        <w:pStyle w:val="ListParagraph"/>
+        <w:numPr>
+          <w:ilvl w:val="0"/>
+          <w:numId w:val="1"/>
+        </w:numPr>
+        <w:ind w:left="284"/>
+        <w:jc w:val="both"/>
+        <w:rPr>
+          <w:sz w:val="24"/>
+          <w:szCs w:val="24"/>
+          <w:lang w:val="en-US"/>
+        </w:rPr>
+      </w:pPr>
+      <w:r>
+        <w:rPr>
+          <w:sz w:val="24"/>
+          <w:szCs w:val="24"/>
+          <w:lang w:val="en-US"/>
+        </w:rPr>
+        <w:t>Datase</w:t>
+      </w:r>
+      <w:r>
+        <w:rPr>
+          <w:sz w:val="24"/>
+          <w:szCs w:val="24"/>
+          <w:lang w:val="en-US"/>
+        </w:rPr>
+        <w:t>t info</w:t>
+      </w:r>
+      <w:r>
+        <w:rPr>
+          <w:sz w:val="24"/>
+          <w:szCs w:val="24"/>
+          <w:lang w:val="en-US"/>
+        </w:rPr>
+        <w:t>:</w:t>
+      </w:r>
+    </w:p>
+    <w:p>
+      <w:pPr>
+        <w:shd w:val="clear" w:color="auto" w:fill="FFFFFF"/>
+        <w:spacing w:after="0" w:line="285" w:lineRule="atLeast"/>
+        <w:ind w:left="284"/>
+        <w:rPr>
+          <w:rFonts w:ascii="Consolas" w:eastAsia="Times New Roman" w:hAnsi="Consolas" w:cs="Times New Roman"/>
+          <w:color w:val="000000"/>
+          <w:kern w:val="0"/>
+          <w:sz w:val="21"/>
+          <w:szCs w:val="21"/>
+          <w:lang w:eastAsia="en-IN"/>
+          <w14:ligatures w14:val="none"/>
+        </w:rPr>
+      </w:pPr>
+      <w:r>
+        <w:rPr>
+          <w:rFonts w:ascii="Consolas" w:eastAsia="Times New Roman" w:hAnsi="Consolas" w:cs="Times New Roman"/>
+          <w:color w:val="AF00DB"/>
+          <w:kern w:val="0"/>
+          <w:sz w:val="21"/>
+          <w:szCs w:val="21"/>
+          <w:lang w:eastAsia="en-IN"/>
+          <w14:ligatures w14:val="none"/>
+        </w:rPr>
+        <w:t>import</w:t>
+      </w:r>
+      <w:r>
+        <w:rPr>
+          <w:rFonts w:ascii="Consolas" w:eastAsia="Times New Roman" w:hAnsi="Consolas" w:cs="Times New Roman"/>
+          <w:color w:val="000000"/>
+          <w:kern w:val="0"/>
+          <w:sz w:val="21"/>
+          <w:szCs w:val="21"/>
+          <w:lang w:eastAsia="en-IN"/>
+          <w14:ligatures w14:val="none"/>
+        </w:rPr>
+        <w:t xml:space="preserve"> </w:t>
+      </w:r>
+      <w:r>
+        <w:rPr>
+          <w:rFonts w:ascii="Consolas" w:eastAsia="Times New Roman" w:hAnsi="Consolas" w:cs="Times New Roman"/>
+          <w:color w:val="267F99"/>
+          <w:kern w:val="0"/>
+          <w:sz w:val="21"/>
+          <w:szCs w:val="21"/>
+          <w:lang w:eastAsia="en-IN"/>
+          <w14:ligatures w14:val="none"/>
+        </w:rPr>
+        <w:t>pandas</w:t>
+      </w:r>
+      <w:r>
+        <w:rPr>
+          <w:rFonts w:ascii="Consolas" w:eastAsia="Times New Roman" w:hAnsi="Consolas" w:cs="Times New Roman"/>
+          <w:color w:val="000000"/>
+          <w:kern w:val="0"/>
+          <w:sz w:val="21"/>
+          <w:szCs w:val="21"/>
+          <w:lang w:eastAsia="en-IN"/>
+          <w14:ligatures w14:val="none"/>
+        </w:rPr>
+        <w:t xml:space="preserve"> </w:t>
+      </w:r>
+      <w:r>
+        <w:rPr>
+          <w:rFonts w:ascii="Consolas" w:eastAsia="Times New Roman" w:hAnsi="Consolas" w:cs="Times New Roman"/>
+          <w:color w:val="AF00DB"/>
+          <w:kern w:val="0"/>
+          <w:sz w:val="21"/>
+          <w:szCs w:val="21"/>
+          <w:lang w:eastAsia="en-IN"/>
+          <w14:ligatures w14:val="none"/>
+        </w:rPr>
+        <w:t>as</w:t>
+      </w:r>
+      <w:r>
+        <w:rPr>
+          <w:rFonts w:ascii="Consolas" w:eastAsia="Times New Roman" w:hAnsi="Consolas" w:cs="Times New Roman"/>
+          <w:color w:val="000000"/>
+          <w:kern w:val="0"/>
+          <w:sz w:val="21"/>
+          <w:szCs w:val="21"/>
+          <w:lang w:eastAsia="en-IN"/>
+          <w14:ligatures w14:val="none"/>
+        </w:rPr>
+        <w:t xml:space="preserve"> </w:t>
+      </w:r>
+      <w:r>
+        <w:rPr>
+          <w:rFonts w:ascii="Consolas" w:eastAsia="Times New Roman" w:hAnsi="Consolas" w:cs="Times New Roman"/>
+          <w:color w:val="267F99"/>
+          <w:kern w:val="0"/>
+          <w:sz w:val="21"/>
+          <w:szCs w:val="21"/>
+          <w:lang w:eastAsia="en-IN"/>
+          <w14:ligatures w14:val="none"/>
+        </w:rPr>
+        <w:t>pd</w:t>
+      </w:r>
+      <w:r>
+        <w:rPr>
+          <w:rFonts w:ascii="Consolas" w:eastAsia="Times New Roman" w:hAnsi="Consolas" w:cs="Times New Roman"/>
+          <w:color w:val="000000"/>
+          <w:kern w:val="0"/>
+          <w:sz w:val="21"/>
+          <w:szCs w:val="21"/>
+          <w:lang w:eastAsia="en-IN"/>
+          <w14:ligatures w14:val="none"/>
+        </w:rPr>
+        <w:t xml:space="preserve"> </w:t>
+      </w:r>
+    </w:p>
+    <w:p>
+      <w:pPr>
+        <w:shd w:val="clear" w:color="auto" w:fill="FFFFFF"/>
+        <w:spacing w:after="0" w:line="285" w:lineRule="atLeast"/>
+        <w:ind w:left="284"/>
+        <w:rPr>
+          <w:rFonts w:ascii="Consolas" w:eastAsia="Times New Roman" w:hAnsi="Consolas" w:cs="Times New Roman"/>
+          <w:color w:val="000000"/>
+          <w:kern w:val="0"/>
+          <w:sz w:val="21"/>
+          <w:szCs w:val="21"/>
+          <w:lang w:eastAsia="en-IN"/>
+          <w14:ligatures w14:val="none"/>
+        </w:rPr>
+      </w:pPr>
+      <w:r>
+        <w:rPr>
+          <w:rFonts w:ascii="Consolas" w:eastAsia="Times New Roman" w:hAnsi="Consolas" w:cs="Times New Roman"/>
+          <w:color w:val="AF00DB"/>
+          <w:kern w:val="0"/>
+          <w:sz w:val="21"/>
+          <w:szCs w:val="21"/>
+          <w:lang w:eastAsia="en-IN"/>
+          <w14:ligatures w14:val="none"/>
+        </w:rPr>
+        <w:t>import</w:t>
+      </w:r>
+      <w:r>
+        <w:rPr>
+          <w:rFonts w:ascii="Consolas" w:eastAsia="Times New Roman" w:hAnsi="Consolas" w:cs="Times New Roman"/>
+          <w:color w:val="000000"/>
+          <w:kern w:val="0"/>
+          <w:sz w:val="21"/>
+          <w:szCs w:val="21"/>
+          <w:lang w:eastAsia="en-IN"/>
+          <w14:ligatures w14:val="none"/>
+        </w:rPr>
+        <w:t xml:space="preserve"> </w:t>
+      </w:r>
+      <w:proofErr w:type="spellStart"/>
+      <w:proofErr w:type="gramStart"/>
+      <w:r>
+        <w:rPr>
+          <w:rFonts w:ascii="Consolas" w:eastAsia="Times New Roman" w:hAnsi="Consolas" w:cs="Times New Roman"/>
+          <w:color w:val="267F99"/>
+          <w:kern w:val="0"/>
+          <w:sz w:val="21"/>
+          <w:szCs w:val="21"/>
+          <w:lang w:eastAsia="en-IN"/>
+          <w14:ligatures w14:val="none"/>
+        </w:rPr>
+        <w:t>matplotlib</w:t>
+      </w:r>
+      <w:r>
+        <w:rPr>
+          <w:rFonts w:ascii="Consolas" w:eastAsia="Times New Roman" w:hAnsi="Consolas" w:cs="Times New Roman"/>
+          <w:color w:val="000000"/>
+          <w:kern w:val="0"/>
+          <w:sz w:val="21"/>
+          <w:szCs w:val="21"/>
+          <w:lang w:eastAsia="en-IN"/>
+          <w14:ligatures w14:val="none"/>
+        </w:rPr>
+        <w:t>.</w:t>
+      </w:r>
+      <w:r>
+        <w:rPr>
+          <w:rFonts w:ascii="Consolas" w:eastAsia="Times New Roman" w:hAnsi="Consolas" w:cs="Times New Roman"/>
+          <w:color w:val="267F99"/>
+          <w:kern w:val="0"/>
+          <w:sz w:val="21"/>
+          <w:szCs w:val="21"/>
+          <w:lang w:eastAsia="en-IN"/>
+          <w14:ligatures w14:val="none"/>
+        </w:rPr>
+        <w:t>pyplot</w:t>
+      </w:r>
+      <w:proofErr w:type="spellEnd"/>
+      <w:proofErr w:type="gramEnd"/>
+      <w:r>
+        <w:rPr>
+          <w:rFonts w:ascii="Consolas" w:eastAsia="Times New Roman" w:hAnsi="Consolas" w:cs="Times New Roman"/>
+          <w:color w:val="000000"/>
+          <w:kern w:val="0"/>
+          <w:sz w:val="21"/>
+          <w:szCs w:val="21"/>
+          <w:lang w:eastAsia="en-IN"/>
+          <w14:ligatures w14:val="none"/>
+        </w:rPr>
+        <w:t xml:space="preserve"> </w:t>
+      </w:r>
+      <w:r>
+        <w:rPr>
+          <w:rFonts w:ascii="Consolas" w:eastAsia="Times New Roman" w:hAnsi="Consolas" w:cs="Times New Roman"/>
+          <w:color w:val="AF00DB"/>
+          <w:kern w:val="0"/>
+          <w:sz w:val="21"/>
+          <w:szCs w:val="21"/>
+          <w:lang w:eastAsia="en-IN"/>
+          <w14:ligatures w14:val="none"/>
+        </w:rPr>
+        <w:t>as</w:t>
+      </w:r>
+      <w:r>
+        <w:rPr>
+          <w:rFonts w:ascii="Consolas" w:eastAsia="Times New Roman" w:hAnsi="Consolas" w:cs="Times New Roman"/>
+          <w:color w:val="000000"/>
+          <w:kern w:val="0"/>
+          <w:sz w:val="21"/>
+          <w:szCs w:val="21"/>
+          <w:lang w:eastAsia="en-IN"/>
+          <w14:ligatures w14:val="none"/>
+        </w:rPr>
+        <w:t xml:space="preserve"> </w:t>
+      </w:r>
+      <w:proofErr w:type="spellStart"/>
+      <w:r>
+        <w:rPr>
+          <w:rFonts w:ascii="Consolas" w:eastAsia="Times New Roman" w:hAnsi="Consolas" w:cs="Times New Roman"/>
+          <w:color w:val="267F99"/>
+          <w:kern w:val="0"/>
+          <w:sz w:val="21"/>
+          <w:szCs w:val="21"/>
+          <w:lang w:eastAsia="en-IN"/>
+          <w14:ligatures w14:val="none"/>
+        </w:rPr>
+        <w:t>plt</w:t>
+      </w:r>
+      <w:proofErr w:type="spellEnd"/>
+      <w:r>
+        <w:rPr>
+          <w:rFonts w:ascii="Consolas" w:eastAsia="Times New Roman" w:hAnsi="Consolas" w:cs="Times New Roman"/>
+          <w:color w:val="000000"/>
+          <w:kern w:val="0"/>
+          <w:sz w:val="21"/>
+          <w:szCs w:val="21"/>
+          <w:lang w:eastAsia="en-IN"/>
+          <w14:ligatures w14:val="none"/>
+        </w:rPr>
+        <w:t xml:space="preserve"> </w:t>
+      </w:r>
+    </w:p>
+    <w:p>
+      <w:pPr>
+        <w:shd w:val="clear" w:color="auto" w:fill="FFFFFF"/>
+        <w:spacing w:after="0" w:line="285" w:lineRule="atLeast"/>
+        <w:ind w:left="284"/>
+        <w:rPr>
+          <w:rFonts w:ascii="Consolas" w:eastAsia="Times New Roman" w:hAnsi="Consolas" w:cs="Times New Roman"/>
+          <w:color w:val="000000"/>
+          <w:kern w:val="0"/>
+          <w:sz w:val="21"/>
+          <w:szCs w:val="21"/>
+          <w:lang w:eastAsia="en-IN"/>
+          <w14:ligatures w14:val="none"/>
+        </w:rPr>
+      </w:pPr>
+    </w:p>
+    <w:p>
+      <w:pPr>
+        <w:shd w:val="clear" w:color="auto" w:fill="FFFFFF"/>
+        <w:spacing w:after="0" w:line="285" w:lineRule="atLeast"/>
+        <w:ind w:left="284"/>
+        <w:rPr>
+          <w:rFonts w:ascii="Consolas" w:eastAsia="Times New Roman" w:hAnsi="Consolas" w:cs="Times New Roman"/>
+          <w:color w:val="000000"/>
+          <w:kern w:val="0"/>
+          <w:sz w:val="21"/>
+          <w:szCs w:val="21"/>
+          <w:lang w:eastAsia="en-IN"/>
+          <w14:ligatures w14:val="none"/>
+        </w:rPr>
+      </w:pPr>
+      <w:proofErr w:type="spellStart"/>
+      <w:r>
+        <w:rPr>
+          <w:rFonts w:ascii="Consolas" w:eastAsia="Times New Roman" w:hAnsi="Consolas" w:cs="Times New Roman"/>
+          <w:color w:val="001080"/>
+          <w:kern w:val="0"/>
+          <w:sz w:val="21"/>
+          <w:szCs w:val="21"/>
+          <w:lang w:eastAsia="en-IN"/>
+          <w14:ligatures w14:val="none"/>
+        </w:rPr>
+        <w:t>df_student</w:t>
+      </w:r>
+      <w:proofErr w:type="spellEnd"/>
+      <w:r>
+        <w:rPr>
+          <w:rFonts w:ascii="Consolas" w:eastAsia="Times New Roman" w:hAnsi="Consolas" w:cs="Times New Roman"/>
+          <w:color w:val="000000"/>
+          <w:kern w:val="0"/>
+          <w:sz w:val="21"/>
+          <w:szCs w:val="21"/>
+          <w:lang w:eastAsia="en-IN"/>
+          <w14:ligatures w14:val="none"/>
+        </w:rPr>
+        <w:t xml:space="preserve"> = </w:t>
+      </w:r>
+      <w:proofErr w:type="spellStart"/>
+      <w:proofErr w:type="gramStart"/>
+      <w:r>
+        <w:rPr>
+          <w:rFonts w:ascii="Consolas" w:eastAsia="Times New Roman" w:hAnsi="Consolas" w:cs="Times New Roman"/>
+          <w:color w:val="267F99"/>
+          <w:kern w:val="0"/>
+          <w:sz w:val="21"/>
+          <w:szCs w:val="21"/>
+          <w:lang w:eastAsia="en-IN"/>
+          <w14:ligatures w14:val="none"/>
+        </w:rPr>
+        <w:t>pd</w:t>
+      </w:r>
+      <w:r>
+        <w:rPr>
+          <w:rFonts w:ascii="Consolas" w:eastAsia="Times New Roman" w:hAnsi="Consolas" w:cs="Times New Roman"/>
+          <w:color w:val="000000"/>
+          <w:kern w:val="0"/>
+          <w:sz w:val="21"/>
+          <w:szCs w:val="21"/>
+          <w:lang w:eastAsia="en-IN"/>
+          <w14:ligatures w14:val="none"/>
+        </w:rPr>
+        <w:t>.</w:t>
+      </w:r>
+      <w:r>
+        <w:rPr>
+          <w:rFonts w:ascii="Consolas" w:eastAsia="Times New Roman" w:hAnsi="Consolas" w:cs="Times New Roman"/>
+          <w:color w:val="795E26"/>
+          <w:kern w:val="0"/>
+          <w:sz w:val="21"/>
+          <w:szCs w:val="21"/>
+          <w:lang w:eastAsia="en-IN"/>
+          <w14:ligatures w14:val="none"/>
+        </w:rPr>
+        <w:t>read</w:t>
+      </w:r>
+      <w:proofErr w:type="gramEnd"/>
+      <w:r>
+        <w:rPr>
+          <w:rFonts w:ascii="Consolas" w:eastAsia="Times New Roman" w:hAnsi="Consolas" w:cs="Times New Roman"/>
+          <w:color w:val="795E26"/>
+          <w:kern w:val="0"/>
+          <w:sz w:val="21"/>
+          <w:szCs w:val="21"/>
+          <w:lang w:eastAsia="en-IN"/>
+          <w14:ligatures w14:val="none"/>
+        </w:rPr>
+        <w:t>_</w:t>
+      </w:r>
+      <w:proofErr w:type="gramStart"/>
+      <w:r>
+        <w:rPr>
+          <w:rFonts w:ascii="Consolas" w:eastAsia="Times New Roman" w:hAnsi="Consolas" w:cs="Times New Roman"/>
+          <w:color w:val="795E26"/>
+          <w:kern w:val="0"/>
+          <w:sz w:val="21"/>
+          <w:szCs w:val="21"/>
+          <w:lang w:eastAsia="en-IN"/>
+          <w14:ligatures w14:val="none"/>
+        </w:rPr>
+        <w:t>csv</w:t>
+      </w:r>
+      <w:proofErr w:type="spellEnd"/>
+      <w:r>
+        <w:rPr>
+          <w:rFonts w:ascii="Consolas" w:eastAsia="Times New Roman" w:hAnsi="Consolas" w:cs="Times New Roman"/>
+          <w:color w:val="000000"/>
+          <w:kern w:val="0"/>
+          <w:sz w:val="21"/>
+          <w:szCs w:val="21"/>
+          <w:lang w:eastAsia="en-IN"/>
+          <w14:ligatures w14:val="none"/>
+        </w:rPr>
+        <w:t>(</w:t>
+      </w:r>
+      <w:proofErr w:type="gramEnd"/>
+      <w:r>
+        <w:rPr>
+          <w:rFonts w:ascii="Consolas" w:eastAsia="Times New Roman" w:hAnsi="Consolas" w:cs="Times New Roman"/>
+          <w:color w:val="A31515"/>
+          <w:kern w:val="0"/>
+          <w:sz w:val="21"/>
+          <w:szCs w:val="21"/>
+          <w:lang w:eastAsia="en-IN"/>
+          <w14:ligatures w14:val="none"/>
+        </w:rPr>
+        <w:t>"dataset.csv"</w:t>
+      </w:r>
+      <w:r>
+        <w:rPr>
+          <w:rFonts w:ascii="Consolas" w:eastAsia="Times New Roman" w:hAnsi="Consolas" w:cs="Times New Roman"/>
+          <w:color w:val="000000"/>
+          <w:kern w:val="0"/>
+          <w:sz w:val="21"/>
+          <w:szCs w:val="21"/>
+          <w:lang w:eastAsia="en-IN"/>
+          <w14:ligatures w14:val="none"/>
+        </w:rPr>
+        <w:t xml:space="preserve">, </w:t>
+      </w:r>
+      <w:r>
+        <w:rPr>
+          <w:rFonts w:ascii="Consolas" w:eastAsia="Times New Roman" w:hAnsi="Consolas" w:cs="Times New Roman"/>
+          <w:color w:val="001080"/>
+          <w:kern w:val="0"/>
+          <w:sz w:val="21"/>
+          <w:szCs w:val="21"/>
+          <w:lang w:eastAsia="en-IN"/>
+          <w14:ligatures w14:val="none"/>
+        </w:rPr>
+        <w:t>delimiter</w:t>
+      </w:r>
+      <w:r>
+        <w:rPr>
+          <w:rFonts w:ascii="Consolas" w:eastAsia="Times New Roman" w:hAnsi="Consolas" w:cs="Times New Roman"/>
+          <w:color w:val="000000"/>
+          <w:kern w:val="0"/>
+          <w:sz w:val="21"/>
+          <w:szCs w:val="21"/>
+          <w:lang w:eastAsia="en-IN"/>
+          <w14:ligatures w14:val="none"/>
+        </w:rPr>
+        <w:t>=</w:t>
+      </w:r>
+      <w:r>
+        <w:rPr>
+          <w:rFonts w:ascii="Consolas" w:eastAsia="Times New Roman" w:hAnsi="Consolas" w:cs="Times New Roman"/>
+          <w:color w:val="A31515"/>
+          <w:kern w:val="0"/>
+          <w:sz w:val="21"/>
+          <w:szCs w:val="21"/>
+          <w:lang w:eastAsia="en-IN"/>
+          <w14:ligatures w14:val="none"/>
+        </w:rPr>
+        <w:t>','</w:t>
+      </w:r>
+      <w:r>
+        <w:rPr>
+          <w:rFonts w:ascii="Consolas" w:eastAsia="Times New Roman" w:hAnsi="Consolas" w:cs="Times New Roman"/>
+          <w:color w:val="000000"/>
+          <w:kern w:val="0"/>
+          <w:sz w:val="21"/>
+          <w:szCs w:val="21"/>
+          <w:lang w:eastAsia="en-IN"/>
+          <w14:ligatures w14:val="none"/>
+        </w:rPr>
+        <w:t xml:space="preserve">, </w:t>
+      </w:r>
+      <w:r>
+        <w:rPr>
+          <w:rFonts w:ascii="Consolas" w:eastAsia="Times New Roman" w:hAnsi="Consolas" w:cs="Times New Roman"/>
+          <w:color w:val="001080"/>
+          <w:kern w:val="0"/>
+          <w:sz w:val="21"/>
+          <w:szCs w:val="21"/>
+          <w:lang w:eastAsia="en-IN"/>
+          <w14:ligatures w14:val="none"/>
+        </w:rPr>
+        <w:t>header</w:t>
+      </w:r>
+      <w:r>
+        <w:rPr>
+          <w:rFonts w:ascii="Consolas" w:eastAsia="Times New Roman" w:hAnsi="Consolas" w:cs="Times New Roman"/>
+          <w:color w:val="000000"/>
+          <w:kern w:val="0"/>
+          <w:sz w:val="21"/>
+          <w:szCs w:val="21"/>
+          <w:lang w:eastAsia="en-IN"/>
+          <w14:ligatures w14:val="none"/>
+        </w:rPr>
+        <w:t>=</w:t>
+      </w:r>
+      <w:r>
+        <w:rPr>
+          <w:rFonts w:ascii="Consolas" w:eastAsia="Times New Roman" w:hAnsi="Consolas" w:cs="Times New Roman"/>
+          <w:color w:val="A31515"/>
+          <w:kern w:val="0"/>
+          <w:sz w:val="21"/>
+          <w:szCs w:val="21"/>
+          <w:lang w:eastAsia="en-IN"/>
+          <w14:ligatures w14:val="none"/>
+        </w:rPr>
+        <w:t>'infer'</w:t>
+      </w:r>
+      <w:r>
+        <w:rPr>
+          <w:rFonts w:ascii="Consolas" w:eastAsia="Times New Roman" w:hAnsi="Consolas" w:cs="Times New Roman"/>
+          <w:color w:val="000000"/>
+          <w:kern w:val="0"/>
+          <w:sz w:val="21"/>
+          <w:szCs w:val="21"/>
+          <w:lang w:eastAsia="en-IN"/>
+          <w14:ligatures w14:val="none"/>
+        </w:rPr>
+        <w:t>)</w:t>
+      </w:r>
+    </w:p>
+    <w:p>
+      <w:pPr>
+        <w:shd w:val="clear" w:color="auto" w:fill="FFFFFF"/>
+        <w:spacing w:after="0" w:line="285" w:lineRule="atLeast"/>
+        <w:ind w:left="284"/>
+        <w:rPr>
+          <w:rFonts w:ascii="Consolas" w:eastAsia="Times New Roman" w:hAnsi="Consolas" w:cs="Times New Roman"/>
+          <w:color w:val="000000"/>
+          <w:kern w:val="0"/>
+          <w:sz w:val="21"/>
+          <w:szCs w:val="21"/>
+          <w:lang w:eastAsia="en-IN"/>
+          <w14:ligatures w14:val="none"/>
+        </w:rPr>
+      </w:pPr>
+    </w:p>
+    <w:p>
+      <w:pPr>
+        <w:shd w:val="clear" w:color="auto" w:fill="FFFFFF"/>
+        <w:spacing w:after="0" w:line="285" w:lineRule="atLeast"/>
+        <w:ind w:left="284"/>
+        <w:rPr>
+          <w:rFonts w:ascii="Consolas" w:eastAsia="Times New Roman" w:hAnsi="Consolas" w:cs="Times New Roman"/>
+          <w:color w:val="000000"/>
+          <w:kern w:val="0"/>
+          <w:sz w:val="21"/>
+          <w:szCs w:val="21"/>
+          <w:lang w:eastAsia="en-IN"/>
+          <w14:ligatures w14:val="none"/>
+        </w:rPr>
+      </w:pPr>
+      <w:proofErr w:type="spellStart"/>
+      <w:r>
+        <w:rPr>
+          <w:rFonts w:ascii="Consolas" w:eastAsia="Times New Roman" w:hAnsi="Consolas" w:cs="Times New Roman"/>
+          <w:color w:val="001080"/>
+          <w:kern w:val="0"/>
+          <w:sz w:val="21"/>
+          <w:szCs w:val="21"/>
+          <w:lang w:eastAsia="en-IN"/>
+          <w14:ligatures w14:val="none"/>
+        </w:rPr>
+        <w:t>df_</w:t>
+      </w:r>
+      <w:proofErr w:type="gramStart"/>
+      <w:r>
+        <w:rPr>
+          <w:rFonts w:ascii="Consolas" w:eastAsia="Times New Roman" w:hAnsi="Consolas" w:cs="Times New Roman"/>
+          <w:color w:val="001080"/>
+          <w:kern w:val="0"/>
+          <w:sz w:val="21"/>
+          <w:szCs w:val="21"/>
+          <w:lang w:eastAsia="en-IN"/>
+          <w14:ligatures w14:val="none"/>
+        </w:rPr>
+        <w:t>student</w:t>
+      </w:r>
+      <w:r>
+        <w:rPr>
+          <w:rFonts w:ascii="Consolas" w:eastAsia="Times New Roman" w:hAnsi="Consolas" w:cs="Times New Roman"/>
+          <w:color w:val="001080"/>
+          <w:kern w:val="0"/>
+          <w:sz w:val="21"/>
+          <w:szCs w:val="21"/>
+          <w:lang w:eastAsia="en-IN"/>
+          <w14:ligatures w14:val="none"/>
+        </w:rPr>
+        <w:t>.head</w:t>
+      </w:r>
+      <w:proofErr w:type="spellEnd"/>
+      <w:proofErr w:type="gramEnd"/>
+      <w:r>
+        <w:rPr>
+          <w:rFonts w:ascii="Consolas" w:eastAsia="Times New Roman" w:hAnsi="Consolas" w:cs="Times New Roman"/>
+          <w:color w:val="001080"/>
+          <w:kern w:val="0"/>
+          <w:sz w:val="21"/>
+          <w:szCs w:val="21"/>
+          <w:lang w:eastAsia="en-IN"/>
+          <w14:ligatures w14:val="none"/>
+        </w:rPr>
+        <w:t>()</w:t>
+      </w:r>
+    </w:p>
+    <w:p>
+      <w:pPr>
+        <w:jc w:val="both"/>
+        <w:rPr>
+          <w:sz w:val="28"/>
+          <w:szCs w:val="28"/>
+          <w:lang w:val="en-US"/>
+        </w:rPr>
+      </w:pPr>
+    </w:p>
+    <w:p>
+      <w:pPr>
+        <w:ind w:left="-76"/>
+        <w:jc w:val="both"/>
+        <w:rPr>
+          <w:sz w:val="24"/>
+          <w:szCs w:val="24"/>
+          <w:lang w:val="en-US"/>
+        </w:rPr>
+      </w:pPr>
+      <w:r>
+        <w:rPr>
+          <w:sz w:val="28"/>
+          <w:szCs w:val="28"/>
+          <w:lang w:val="en-US"/>
+        </w:rPr>
+        <w:drawing>
+          <wp:anchor distT="0" distB="0" distL="114300" distR="114300" simplePos="0" relativeHeight="251658240" behindDoc="0" locked="0" layoutInCell="1" allowOverlap="1" wp14:anchorId="5609DA24" wp14:editId="6A710F2D">
+            <wp:simplePos x="0" y="0"/>
+            <wp:positionH relativeFrom="column">
+              <wp:posOffset>-48260</wp:posOffset>
+            </wp:positionH>
+            <wp:positionV relativeFrom="paragraph">
+              <wp:posOffset>241935</wp:posOffset>
+            </wp:positionV>
+            <wp:extent cx="3255645" cy="1200150"/>
+            <wp:effectExtent l="0" t="0" r="1905" b="0"/>
+            <wp:wrapThrough wrapText="bothSides">
+              <wp:wrapPolygon edited="0">
+                <wp:start x="0" y="0"/>
+                <wp:lineTo x="0" y="21257"/>
+                <wp:lineTo x="21486" y="21257"/>
+                <wp:lineTo x="21486" y="0"/>
+                <wp:lineTo x="0" y="0"/>
+              </wp:wrapPolygon>
+            </wp:wrapThrough>
+            <wp:docPr id="2019029660" name="Picture 1"/>
+            <wp:cNvGraphicFramePr>
+              <a:graphicFrameLocks xmlns:a="http://schemas.openxmlformats.org/drawingml/2006/main" noChangeAspect="1"/>
+            </wp:cNvGraphicFramePr>
+            <a:graphic xmlns:a="http://schemas.openxmlformats.org/drawingml/2006/main">
+              <a:graphicData uri="http://schemas.openxmlformats.org/drawingml/2006/picture">
+                <pic:pic xmlns:pic="http://schemas.openxmlformats.org/drawingml/2006/picture">
+                  <pic:nvPicPr>
+                    <pic:cNvPr id="2019029660" name=""/>
+                    <pic:cNvPicPr/>
+                  </pic:nvPicPr>
+                  <pic:blipFill>
+                    <a:blip r:embed="rId8">
+                      <a:extLst>
+                        <a:ext uri="{28A0092B-C50C-407E-A947-70E740481C1C}">
+                          <a14:useLocalDpi xmlns:a14="http://schemas.microsoft.com/office/drawing/2010/main" val="0"/>
+                        </a:ext>
+                      </a:extLst>
+                    </a:blip>
+                    <a:stretch>
+                      <a:fillRect/>
+                    </a:stretch>
+                  </pic:blipFill>
+                  <pic:spPr>
+                    <a:xfrm>
+                      <a:off x="0" y="0"/>
+                      <a:ext cx="3255645" cy="1200150"/>
+                    </a:xfrm>
+                    <a:prstGeom prst="rect">
+                      <a:avLst/>
+                    </a:prstGeom>
+                  </pic:spPr>
+                </pic:pic>
+              </a:graphicData>
+            </a:graphic>
+            <wp14:sizeRelH relativeFrom="margin">
+              <wp14:pctWidth>0</wp14:pctWidth>
+            </wp14:sizeRelH>
+            <wp14:sizeRelV relativeFrom="margin">
+              <wp14:pctHeight>0</wp14:pctHeight>
+            </wp14:sizeRelV>
+          </wp:anchor>
+        </w:drawing>
+      </w:r>
+      <w:r>
+        <w:rPr>
+          <w:sz w:val="24"/>
+          <w:szCs w:val="24"/>
+          <w:lang w:val="en-US"/>
+        </w:rPr>
+        <w:tab/>
+        <w:t>Output:</w:t>
+      </w:r>
+    </w:p>
+    <w:p>
+      <w:pPr>
+        <w:ind w:left="-76"/>
+        <w:jc w:val="both"/>
+        <w:rPr>
+          <w:sz w:val="28"/>
+          <w:szCs w:val="28"/>
+          <w:lang w:val="en-US"/>
+        </w:rPr>
+      </w:pPr>
+    </w:p>
+    <w:p>
+      <w:pPr>
+        <w:rPr>
+          <w:sz w:val="28"/>
+          <w:szCs w:val="28"/>
+          <w:lang w:val="en-US"/>
+        </w:rPr>
+      </w:pPr>
+    </w:p>
+    <w:p>
+      <w:pPr>
+        <w:rPr>
+          <w:sz w:val="28"/>
+          <w:szCs w:val="28"/>
+          <w:lang w:val="en-US"/>
+        </w:rPr>
+      </w:pPr>
+    </w:p>
+    <w:p>
+      <w:pPr>
+        <w:rPr>
+          <w:sz w:val="28"/>
+          <w:szCs w:val="28"/>
+          <w:lang w:val="en-US"/>
+        </w:rPr>
+      </w:pPr>
+    </w:p>
+    <w:p>
+      <w:pPr>
+        <w:rPr>
+          <w:sz w:val="24"/>
+          <w:szCs w:val="24"/>
+          <w:lang w:val="en-US"/>
+        </w:rPr>
+      </w:pPr>
+      <w:proofErr w:type="gramStart"/>
+      <w:r>
+        <w:rPr>
+          <w:sz w:val="24"/>
+          <w:szCs w:val="24"/>
+          <w:lang w:val="en-US"/>
+        </w:rPr>
+        <w:t>head(</w:t>
+      </w:r>
+      <w:proofErr w:type="gramEnd"/>
+      <w:r>
+        <w:rPr>
+          <w:sz w:val="24"/>
+          <w:szCs w:val="24"/>
+          <w:lang w:val="en-US"/>
+        </w:rPr>
+        <w:t xml:space="preserve">) function is used to print the first 5 records of the </w:t>
+      </w:r>
+      <w:proofErr w:type="spellStart"/>
+      <w:r>
+        <w:rPr>
+          <w:sz w:val="24"/>
+          <w:szCs w:val="24"/>
+          <w:lang w:val="en-US"/>
+        </w:rPr>
+        <w:t>dataframe</w:t>
+      </w:r>
+      <w:proofErr w:type="spellEnd"/>
+      <w:r>
+        <w:rPr>
+          <w:sz w:val="24"/>
+          <w:szCs w:val="24"/>
+          <w:lang w:val="en-US"/>
+        </w:rPr>
+        <w:t>.</w:t>
+      </w:r>
+    </w:p>
+    <w:p>
+      <w:pPr>
+        <w:rPr>
+          <w:sz w:val="24"/>
+          <w:szCs w:val="24"/>
+          <w:lang w:val="en-US"/>
+        </w:rPr>
+      </w:pPr>
+      <w:r>
+        <w:rPr>
+          <w:sz w:val="24"/>
+          <w:szCs w:val="24"/>
+          <w:lang w:val="en-US"/>
+        </w:rPr>
+        <w:t>We can use `</w:t>
+      </w:r>
+      <w:proofErr w:type="spellStart"/>
+      <w:r>
+        <w:rPr>
+          <w:sz w:val="24"/>
+          <w:szCs w:val="24"/>
+          <w:lang w:val="en-US"/>
+        </w:rPr>
+        <w:t>dtypes</w:t>
+      </w:r>
+      <w:proofErr w:type="spellEnd"/>
+      <w:r>
+        <w:rPr>
+          <w:sz w:val="24"/>
+          <w:szCs w:val="24"/>
+          <w:lang w:val="en-US"/>
+        </w:rPr>
+        <w:t>` attribute to give out datatype of each column.</w:t>
+      </w:r>
+    </w:p>
+    <w:p>
+      <w:pPr>
+        <w:shd w:val="clear" w:color="auto" w:fill="FFFFFF"/>
+        <w:spacing w:after="0" w:line="285" w:lineRule="atLeast"/>
+        <w:ind w:firstLine="284"/>
+        <w:rPr>
+          <w:rFonts w:ascii="Consolas" w:eastAsia="Times New Roman" w:hAnsi="Consolas" w:cs="Times New Roman"/>
+          <w:color w:val="000000"/>
+          <w:kern w:val="0"/>
+          <w:sz w:val="21"/>
+          <w:szCs w:val="21"/>
+          <w:lang w:eastAsia="en-IN"/>
+          <w14:ligatures w14:val="none"/>
+        </w:rPr>
+      </w:pPr>
+      <w:proofErr w:type="spellStart"/>
+      <w:r>
+        <w:rPr>
+          <w:rFonts w:ascii="Consolas" w:eastAsia="Times New Roman" w:hAnsi="Consolas" w:cs="Times New Roman"/>
+          <w:color w:val="001080"/>
+          <w:kern w:val="0"/>
+          <w:sz w:val="21"/>
+          <w:szCs w:val="21"/>
+          <w:lang w:eastAsia="en-IN"/>
+          <w14:ligatures w14:val="none"/>
+        </w:rPr>
+        <w:t>df_</w:t>
+      </w:r>
+      <w:proofErr w:type="gramStart"/>
+      <w:r>
+        <w:rPr>
+          <w:rFonts w:ascii="Consolas" w:eastAsia="Times New Roman" w:hAnsi="Consolas" w:cs="Times New Roman"/>
+          <w:color w:val="001080"/>
+          <w:kern w:val="0"/>
+          <w:sz w:val="21"/>
+          <w:szCs w:val="21"/>
+          <w:lang w:eastAsia="en-IN"/>
+          <w14:ligatures w14:val="none"/>
+        </w:rPr>
+        <w:t>student</w:t>
+      </w:r>
+      <w:r>
+        <w:rPr>
+          <w:rFonts w:ascii="Consolas" w:eastAsia="Times New Roman" w:hAnsi="Consolas" w:cs="Times New Roman"/>
+          <w:color w:val="000000"/>
+          <w:kern w:val="0"/>
+          <w:sz w:val="21"/>
+          <w:szCs w:val="21"/>
+          <w:lang w:eastAsia="en-IN"/>
+          <w14:ligatures w14:val="none"/>
+        </w:rPr>
+        <w:t>.</w:t>
+      </w:r>
+      <w:r>
+        <w:rPr>
+          <w:rFonts w:ascii="Consolas" w:eastAsia="Times New Roman" w:hAnsi="Consolas" w:cs="Times New Roman"/>
+          <w:color w:val="001080"/>
+          <w:kern w:val="0"/>
+          <w:sz w:val="21"/>
+          <w:szCs w:val="21"/>
+          <w:lang w:eastAsia="en-IN"/>
+          <w14:ligatures w14:val="none"/>
+        </w:rPr>
+        <w:t>dtypes</w:t>
+      </w:r>
+      <w:proofErr w:type="spellEnd"/>
+      <w:proofErr w:type="gramEnd"/>
+    </w:p>
+    <w:p>
+      <w:pPr>
+        <w:rPr>
+          <w:sz w:val="24"/>
+          <w:szCs w:val="24"/>
+          <w:lang w:val="en-US"/>
+        </w:rPr>
+      </w:pPr>
+    </w:p>
+    <w:p>
+      <w:pPr>
+        <w:rPr>
+          <w:sz w:val="24"/>
+          <w:szCs w:val="24"/>
+          <w:lang w:val="en-US"/>
+        </w:rPr>
+      </w:pPr>
+      <w:r>
+        <w:rPr>
+          <w:sz w:val="24"/>
+          <w:szCs w:val="24"/>
+          <w:lang w:val="en-US"/>
+        </w:rPr>
+        <w:drawing>
+          <wp:anchor distT="0" distB="0" distL="114300" distR="114300" simplePos="0" relativeHeight="251659264" behindDoc="1" locked="0" layoutInCell="1" allowOverlap="1" wp14:anchorId="762CD7A6" wp14:editId="6F68A48C">
+            <wp:simplePos x="0" y="0"/>
+            <wp:positionH relativeFrom="column">
+              <wp:posOffset>-47625</wp:posOffset>
+            </wp:positionH>
+            <wp:positionV relativeFrom="paragraph">
+              <wp:posOffset>299085</wp:posOffset>
+            </wp:positionV>
+            <wp:extent cx="1800225" cy="1374572"/>
+            <wp:effectExtent l="0" t="0" r="0" b="0"/>
+            <wp:wrapNone/>
+            <wp:docPr id="2095974331" name="Picture 1"/>
+            <wp:cNvGraphicFramePr>
+              <a:graphicFrameLocks xmlns:a="http://schemas.openxmlformats.org/drawingml/2006/main" noChangeAspect="1"/>
+            </wp:cNvGraphicFramePr>
+            <a:graphic xmlns:a="http://schemas.openxmlformats.org/drawingml/2006/main">
+              <a:graphicData uri="http://schemas.openxmlformats.org/drawingml/2006/picture">
+                <pic:pic xmlns:pic="http://schemas.openxmlformats.org/drawingml/2006/picture">
+                  <pic:nvPicPr>
+                    <pic:cNvPr id="2095974331" name=""/>
+                    <pic:cNvPicPr/>
+                  </pic:nvPicPr>
+                  <pic:blipFill>
+                    <a:blip r:embed="rId9">
+                      <a:extLst>
+                        <a:ext uri="{28A0092B-C50C-407E-A947-70E740481C1C}">
+                          <a14:useLocalDpi xmlns:a14="http://schemas.microsoft.com/office/drawing/2010/main" val="0"/>
+                        </a:ext>
+                      </a:extLst>
+                    </a:blip>
+                    <a:stretch>
+                      <a:fillRect/>
+                    </a:stretch>
+                  </pic:blipFill>
+                  <pic:spPr>
+                    <a:xfrm>
+                      <a:off x="0" y="0"/>
+                      <a:ext cx="1800225" cy="1374572"/>
+                    </a:xfrm>
+                    <a:prstGeom prst="rect">
+                      <a:avLst/>
+                    </a:prstGeom>
+                  </pic:spPr>
+                </pic:pic>
+              </a:graphicData>
+            </a:graphic>
+            <wp14:sizeRelH relativeFrom="margin">
+              <wp14:pctWidth>0</wp14:pctWidth>
+            </wp14:sizeRelH>
+            <wp14:sizeRelV relativeFrom="margin">
+              <wp14:pctHeight>0</wp14:pctHeight>
+            </wp14:sizeRelV>
+          </wp:anchor>
+        </w:drawing>
+      </w:r>
+      <w:r>
+        <w:rPr>
+          <w:sz w:val="24"/>
+          <w:szCs w:val="24"/>
+          <w:lang w:val="en-US"/>
+        </w:rPr>
+        <w:t>Output:</w:t>
+      </w:r>
+    </w:p>
+    <w:p>
+      <w:pPr>
+        <w:rPr>
+          <w:sz w:val="28"/>
+          <w:szCs w:val="28"/>
+          <w:lang w:val="en-US"/>
+        </w:rPr>
+      </w:pPr>
+    </w:p>
+    <w:p>
+      <w:pPr>
+        <w:rPr>
+          <w:sz w:val="28"/>
+          <w:szCs w:val="28"/>
+          <w:lang w:val="en-US"/>
+        </w:rPr>
+      </w:pPr>
+    </w:p>
+    <w:p>
+      <w:pPr>
+        <w:rPr>
+          <w:sz w:val="28"/>
+          <w:szCs w:val="28"/>
+          <w:lang w:val="en-US"/>
+        </w:rPr>
+      </w:pPr>
+    </w:p>
+    <w:p>
+      <w:pPr>
+        <w:rPr>
+          <w:sz w:val="28"/>
+          <w:szCs w:val="28"/>
+          <w:lang w:val="en-US"/>
+        </w:rPr>
+      </w:pPr>
+    </w:p>
+    <w:p>
+      <w:pPr>
+        <w:rPr>
+          <w:sz w:val="28"/>
+          <w:szCs w:val="28"/>
+          <w:lang w:val="en-US"/>
+        </w:rPr>
+      </w:pPr>
+    </w:p>
+    <w:p>
+      <w:pPr>
+        <w:rPr>
+          <w:sz w:val="24"/>
+          <w:szCs w:val="24"/>
+          <w:lang w:val="en-US"/>
+        </w:rPr>
+      </w:pPr>
+      <w:r>
+        <w:rPr>
+          <w:sz w:val="24"/>
+          <w:szCs w:val="24"/>
+          <w:lang w:val="en-US"/>
+        </w:rPr>
+        <w:t xml:space="preserve">The dataset we chose contains 50 records. These records were Name, Gender, Grade, </w:t>
+      </w:r>
+      <w:proofErr w:type="spellStart"/>
+      <w:r>
+        <w:rPr>
+          <w:sz w:val="24"/>
+          <w:szCs w:val="24"/>
+          <w:lang w:val="en-US"/>
+        </w:rPr>
+        <w:t>StudyHours</w:t>
+      </w:r>
+      <w:proofErr w:type="spellEnd"/>
+      <w:r>
+        <w:rPr>
+          <w:sz w:val="24"/>
+          <w:szCs w:val="24"/>
+          <w:lang w:val="en-US"/>
+        </w:rPr>
+        <w:t xml:space="preserve">, Marks &amp; Attendance. </w:t>
+      </w:r>
+    </w:p>
+    <w:p>
+      <w:pPr>
+        <w:rPr>
+          <w:sz w:val="24"/>
+          <w:szCs w:val="24"/>
+          <w:lang w:val="en-US"/>
+        </w:rPr>
+      </w:pPr>
       <w:r>
         <w:rPr>
           <w:b/>
           <w:bCs/>
-          <w:sz w:val="32"/>
-          <w:szCs w:val="32"/>
-          <w:lang w:val="en-US"/>
-        </w:rPr>
-        <w:t xml:space="preserve">College a real-life dataset and identify different types of </w:t>
-      </w:r>
-      <w:proofErr w:type="gramStart"/>
+          <w:sz w:val="24"/>
+          <w:szCs w:val="24"/>
+          <w:lang w:val="en-US"/>
+        </w:rPr>
+        <w:t>Numerical Columns</w:t>
+      </w:r>
+      <w:r>
+        <w:rPr>
+          <w:sz w:val="24"/>
+          <w:szCs w:val="24"/>
+          <w:lang w:val="en-US"/>
+        </w:rPr>
+        <w:t xml:space="preserve">: Marks, </w:t>
+      </w:r>
+      <w:proofErr w:type="spellStart"/>
+      <w:r>
+        <w:rPr>
+          <w:sz w:val="24"/>
+          <w:szCs w:val="24"/>
+          <w:lang w:val="en-US"/>
+        </w:rPr>
+        <w:t>StudyHours</w:t>
+      </w:r>
+      <w:proofErr w:type="spellEnd"/>
+      <w:r>
+        <w:rPr>
+          <w:sz w:val="24"/>
+          <w:szCs w:val="24"/>
+          <w:lang w:val="en-US"/>
+        </w:rPr>
+        <w:t>, Attendance</w:t>
+      </w:r>
+    </w:p>
+    <w:p>
+      <w:pPr>
+        <w:rPr>
+          <w:sz w:val="24"/>
+          <w:szCs w:val="24"/>
+          <w:lang w:val="en-US"/>
+        </w:rPr>
+      </w:pPr>
       <w:r>
         <w:rPr>
           <w:b/>
           <w:bCs/>
-          <w:sz w:val="32"/>
-          <w:szCs w:val="32"/>
-          <w:lang w:val="en-US"/>
-        </w:rPr>
-        <w:t>data(</w:t>
+          <w:sz w:val="24"/>
+          <w:szCs w:val="24"/>
+          <w:lang w:val="en-US"/>
+        </w:rPr>
+        <w:lastRenderedPageBreak/>
+        <w:t>Categorial Columns</w:t>
+      </w:r>
+      <w:r>
+        <w:rPr>
+          <w:sz w:val="24"/>
+          <w:szCs w:val="24"/>
+          <w:lang w:val="en-US"/>
+        </w:rPr>
+        <w:t>: Gender(M/F), Grade(A/B/C/D)</w:t>
+      </w:r>
+    </w:p>
+    <w:p>
+      <w:pPr>
+        <w:rPr>
+          <w:sz w:val="24"/>
+          <w:szCs w:val="24"/>
+          <w:lang w:val="en-US"/>
+        </w:rPr>
+      </w:pPr>
+    </w:p>
+    <w:p>
+      <w:pPr>
+        <w:pStyle w:val="ListParagraph"/>
+        <w:numPr>
+          <w:ilvl w:val="0"/>
+          <w:numId w:val="1"/>
+        </w:numPr>
+        <w:ind w:left="284"/>
+        <w:rPr>
+          <w:sz w:val="24"/>
+          <w:szCs w:val="24"/>
+          <w:lang w:val="en-US"/>
+        </w:rPr>
+      </w:pPr>
+      <w:r>
+        <w:rPr>
+          <w:sz w:val="24"/>
+          <w:szCs w:val="24"/>
+          <w:lang w:val="en-US"/>
+        </w:rPr>
+        <w:t>Analysis of dataset</w:t>
+      </w:r>
+    </w:p>
+    <w:p>
+      <w:pPr>
+        <w:pStyle w:val="ListParagraph"/>
+        <w:ind w:left="284"/>
+        <w:rPr>
+          <w:sz w:val="24"/>
+          <w:szCs w:val="24"/>
+          <w:lang w:val="en-US"/>
+        </w:rPr>
+      </w:pPr>
+      <w:r>
+        <w:rPr>
+          <w:sz w:val="24"/>
+          <w:szCs w:val="24"/>
+          <w:lang w:val="en-US"/>
+        </w:rPr>
+        <w:t xml:space="preserve">We can use bar &amp; pie charts to gather some useful </w:t>
+      </w:r>
+      <w:r>
+        <w:rPr>
+          <w:sz w:val="24"/>
+          <w:szCs w:val="24"/>
+          <w:lang w:val="en-US"/>
+        </w:rPr>
+        <w:t>observations from the dataset</w:t>
+      </w:r>
+    </w:p>
+    <w:p>
+      <w:pPr>
+        <w:rPr>
+          <w:sz w:val="24"/>
+          <w:szCs w:val="24"/>
+          <w:lang w:val="en-US"/>
+        </w:rPr>
+      </w:pPr>
+    </w:p>
+    <w:p>
+      <w:pPr>
+        <w:pStyle w:val="ListParagraph"/>
+        <w:numPr>
+          <w:ilvl w:val="0"/>
+          <w:numId w:val="2"/>
+        </w:numPr>
+        <w:ind w:left="567" w:hanging="283"/>
+        <w:rPr>
+          <w:sz w:val="24"/>
+          <w:szCs w:val="24"/>
+          <w:lang w:val="en-US"/>
+        </w:rPr>
+      </w:pPr>
+      <w:r>
+        <w:rPr>
+          <w:sz w:val="24"/>
+          <w:szCs w:val="24"/>
+          <w:lang w:val="en-US"/>
+        </w:rPr>
+        <w:t>Gender distribution</w:t>
+      </w:r>
+    </w:p>
+    <w:p>
+      <w:pPr>
+        <w:shd w:val="clear" w:color="auto" w:fill="FFFFFF"/>
+        <w:spacing w:after="0" w:line="285" w:lineRule="atLeast"/>
+        <w:ind w:left="567"/>
+        <w:rPr>
+          <w:rFonts w:ascii="Consolas" w:eastAsia="Times New Roman" w:hAnsi="Consolas" w:cs="Times New Roman"/>
+          <w:color w:val="000000"/>
+          <w:kern w:val="0"/>
+          <w:sz w:val="21"/>
+          <w:szCs w:val="21"/>
+          <w:lang w:eastAsia="en-IN"/>
+          <w14:ligatures w14:val="none"/>
+        </w:rPr>
+      </w:pPr>
+      <w:r>
+        <w:rPr>
+          <w:rFonts w:ascii="Consolas" w:eastAsia="Times New Roman" w:hAnsi="Consolas" w:cs="Times New Roman"/>
+          <w:color w:val="001080"/>
+          <w:kern w:val="0"/>
+          <w:sz w:val="21"/>
+          <w:szCs w:val="21"/>
+          <w:lang w:eastAsia="en-IN"/>
+          <w14:ligatures w14:val="none"/>
+        </w:rPr>
+        <w:t>counts</w:t>
+      </w:r>
+      <w:r>
+        <w:rPr>
+          <w:rFonts w:ascii="Consolas" w:eastAsia="Times New Roman" w:hAnsi="Consolas" w:cs="Times New Roman"/>
+          <w:color w:val="000000"/>
+          <w:kern w:val="0"/>
+          <w:sz w:val="21"/>
+          <w:szCs w:val="21"/>
+          <w:lang w:eastAsia="en-IN"/>
+          <w14:ligatures w14:val="none"/>
+        </w:rPr>
+        <w:t xml:space="preserve"> = </w:t>
+      </w:r>
+      <w:proofErr w:type="spellStart"/>
+      <w:r>
+        <w:rPr>
+          <w:rFonts w:ascii="Consolas" w:eastAsia="Times New Roman" w:hAnsi="Consolas" w:cs="Times New Roman"/>
+          <w:color w:val="001080"/>
+          <w:kern w:val="0"/>
+          <w:sz w:val="21"/>
+          <w:szCs w:val="21"/>
+          <w:lang w:eastAsia="en-IN"/>
+          <w14:ligatures w14:val="none"/>
+        </w:rPr>
+        <w:t>df_</w:t>
+      </w:r>
+      <w:proofErr w:type="gramStart"/>
+      <w:r>
+        <w:rPr>
+          <w:rFonts w:ascii="Consolas" w:eastAsia="Times New Roman" w:hAnsi="Consolas" w:cs="Times New Roman"/>
+          <w:color w:val="001080"/>
+          <w:kern w:val="0"/>
+          <w:sz w:val="21"/>
+          <w:szCs w:val="21"/>
+          <w:lang w:eastAsia="en-IN"/>
+          <w14:ligatures w14:val="none"/>
+        </w:rPr>
+        <w:t>student</w:t>
+      </w:r>
+      <w:r>
+        <w:rPr>
+          <w:rFonts w:ascii="Consolas" w:eastAsia="Times New Roman" w:hAnsi="Consolas" w:cs="Times New Roman"/>
+          <w:color w:val="000000"/>
+          <w:kern w:val="0"/>
+          <w:sz w:val="21"/>
+          <w:szCs w:val="21"/>
+          <w:lang w:eastAsia="en-IN"/>
+          <w14:ligatures w14:val="none"/>
+        </w:rPr>
+        <w:t>.</w:t>
+      </w:r>
+      <w:r>
+        <w:rPr>
+          <w:rFonts w:ascii="Consolas" w:eastAsia="Times New Roman" w:hAnsi="Consolas" w:cs="Times New Roman"/>
+          <w:color w:val="001080"/>
+          <w:kern w:val="0"/>
+          <w:sz w:val="21"/>
+          <w:szCs w:val="21"/>
+          <w:lang w:eastAsia="en-IN"/>
+          <w14:ligatures w14:val="none"/>
+        </w:rPr>
+        <w:t>Gender</w:t>
+      </w:r>
+      <w:r>
+        <w:rPr>
+          <w:rFonts w:ascii="Consolas" w:eastAsia="Times New Roman" w:hAnsi="Consolas" w:cs="Times New Roman"/>
+          <w:color w:val="000000"/>
+          <w:kern w:val="0"/>
+          <w:sz w:val="21"/>
+          <w:szCs w:val="21"/>
+          <w:lang w:eastAsia="en-IN"/>
+          <w14:ligatures w14:val="none"/>
+        </w:rPr>
+        <w:t>.</w:t>
+      </w:r>
+      <w:r>
+        <w:rPr>
+          <w:rFonts w:ascii="Consolas" w:eastAsia="Times New Roman" w:hAnsi="Consolas" w:cs="Times New Roman"/>
+          <w:color w:val="795E26"/>
+          <w:kern w:val="0"/>
+          <w:sz w:val="21"/>
+          <w:szCs w:val="21"/>
+          <w:lang w:eastAsia="en-IN"/>
+          <w14:ligatures w14:val="none"/>
+        </w:rPr>
+        <w:t>value</w:t>
       </w:r>
       <w:proofErr w:type="gramEnd"/>
       <w:r>
+        <w:rPr>
+          <w:rFonts w:ascii="Consolas" w:eastAsia="Times New Roman" w:hAnsi="Consolas" w:cs="Times New Roman"/>
+          <w:color w:val="795E26"/>
+          <w:kern w:val="0"/>
+          <w:sz w:val="21"/>
+          <w:szCs w:val="21"/>
+          <w:lang w:eastAsia="en-IN"/>
+          <w14:ligatures w14:val="none"/>
+        </w:rPr>
+        <w:t>_</w:t>
+      </w:r>
+      <w:proofErr w:type="gramStart"/>
+      <w:r>
+        <w:rPr>
+          <w:rFonts w:ascii="Consolas" w:eastAsia="Times New Roman" w:hAnsi="Consolas" w:cs="Times New Roman"/>
+          <w:color w:val="795E26"/>
+          <w:kern w:val="0"/>
+          <w:sz w:val="21"/>
+          <w:szCs w:val="21"/>
+          <w:lang w:eastAsia="en-IN"/>
+          <w14:ligatures w14:val="none"/>
+        </w:rPr>
+        <w:t>counts</w:t>
+      </w:r>
+      <w:proofErr w:type="spellEnd"/>
+      <w:r>
+        <w:rPr>
+          <w:rFonts w:ascii="Consolas" w:eastAsia="Times New Roman" w:hAnsi="Consolas" w:cs="Times New Roman"/>
+          <w:color w:val="000000"/>
+          <w:kern w:val="0"/>
+          <w:sz w:val="21"/>
+          <w:szCs w:val="21"/>
+          <w:lang w:eastAsia="en-IN"/>
+          <w14:ligatures w14:val="none"/>
+        </w:rPr>
+        <w:t>(</w:t>
+      </w:r>
+      <w:proofErr w:type="gramEnd"/>
+      <w:r>
+        <w:rPr>
+          <w:rFonts w:ascii="Consolas" w:eastAsia="Times New Roman" w:hAnsi="Consolas" w:cs="Times New Roman"/>
+          <w:color w:val="000000"/>
+          <w:kern w:val="0"/>
+          <w:sz w:val="21"/>
+          <w:szCs w:val="21"/>
+          <w:lang w:eastAsia="en-IN"/>
+          <w14:ligatures w14:val="none"/>
+        </w:rPr>
+        <w:t>)</w:t>
+      </w:r>
+    </w:p>
+    <w:p>
+      <w:pPr>
+        <w:shd w:val="clear" w:color="auto" w:fill="FFFFFF"/>
+        <w:spacing w:after="0" w:line="285" w:lineRule="atLeast"/>
+        <w:ind w:left="567"/>
+        <w:rPr>
+          <w:rFonts w:ascii="Consolas" w:eastAsia="Times New Roman" w:hAnsi="Consolas" w:cs="Times New Roman"/>
+          <w:color w:val="001080"/>
+          <w:kern w:val="0"/>
+          <w:sz w:val="21"/>
+          <w:szCs w:val="21"/>
+          <w:lang w:eastAsia="en-IN"/>
+          <w14:ligatures w14:val="none"/>
+        </w:rPr>
+      </w:pPr>
+      <w:proofErr w:type="spellStart"/>
+      <w:proofErr w:type="gramStart"/>
+      <w:r>
+        <w:rPr>
+          <w:rFonts w:ascii="Consolas" w:eastAsia="Times New Roman" w:hAnsi="Consolas" w:cs="Times New Roman"/>
+          <w:color w:val="267F99"/>
+          <w:kern w:val="0"/>
+          <w:sz w:val="21"/>
+          <w:szCs w:val="21"/>
+          <w:lang w:eastAsia="en-IN"/>
+          <w14:ligatures w14:val="none"/>
+        </w:rPr>
+        <w:t>plt</w:t>
+      </w:r>
+      <w:r>
+        <w:rPr>
+          <w:rFonts w:ascii="Consolas" w:eastAsia="Times New Roman" w:hAnsi="Consolas" w:cs="Times New Roman"/>
+          <w:color w:val="000000"/>
+          <w:kern w:val="0"/>
+          <w:sz w:val="21"/>
+          <w:szCs w:val="21"/>
+          <w:lang w:eastAsia="en-IN"/>
+          <w14:ligatures w14:val="none"/>
+        </w:rPr>
+        <w:t>.</w:t>
+      </w:r>
+      <w:r>
+        <w:rPr>
+          <w:rFonts w:ascii="Consolas" w:eastAsia="Times New Roman" w:hAnsi="Consolas" w:cs="Times New Roman"/>
+          <w:color w:val="795E26"/>
+          <w:kern w:val="0"/>
+          <w:sz w:val="21"/>
+          <w:szCs w:val="21"/>
+          <w:lang w:eastAsia="en-IN"/>
+          <w14:ligatures w14:val="none"/>
+        </w:rPr>
+        <w:t>pie</w:t>
+      </w:r>
+      <w:proofErr w:type="spellEnd"/>
+      <w:r>
+        <w:rPr>
+          <w:rFonts w:ascii="Consolas" w:eastAsia="Times New Roman" w:hAnsi="Consolas" w:cs="Times New Roman"/>
+          <w:color w:val="000000"/>
+          <w:kern w:val="0"/>
+          <w:sz w:val="21"/>
+          <w:szCs w:val="21"/>
+          <w:lang w:eastAsia="en-IN"/>
+          <w14:ligatures w14:val="none"/>
+        </w:rPr>
+        <w:t>(</w:t>
+      </w:r>
+      <w:proofErr w:type="gramEnd"/>
+      <w:r>
+        <w:rPr>
+          <w:rFonts w:ascii="Consolas" w:eastAsia="Times New Roman" w:hAnsi="Consolas" w:cs="Times New Roman"/>
+          <w:color w:val="001080"/>
+          <w:kern w:val="0"/>
+          <w:sz w:val="21"/>
+          <w:szCs w:val="21"/>
+          <w:lang w:eastAsia="en-IN"/>
+          <w14:ligatures w14:val="none"/>
+        </w:rPr>
+        <w:t>counts</w:t>
+      </w:r>
+      <w:r>
+        <w:rPr>
+          <w:rFonts w:ascii="Consolas" w:eastAsia="Times New Roman" w:hAnsi="Consolas" w:cs="Times New Roman"/>
+          <w:color w:val="000000"/>
+          <w:kern w:val="0"/>
+          <w:sz w:val="21"/>
+          <w:szCs w:val="21"/>
+          <w:lang w:eastAsia="en-IN"/>
+          <w14:ligatures w14:val="none"/>
+        </w:rPr>
+        <w:t xml:space="preserve">, </w:t>
+      </w:r>
+      <w:r>
+        <w:rPr>
+          <w:rFonts w:ascii="Consolas" w:eastAsia="Times New Roman" w:hAnsi="Consolas" w:cs="Times New Roman"/>
+          <w:color w:val="001080"/>
+          <w:kern w:val="0"/>
+          <w:sz w:val="21"/>
+          <w:szCs w:val="21"/>
+          <w:lang w:eastAsia="en-IN"/>
+          <w14:ligatures w14:val="none"/>
+        </w:rPr>
+        <w:t>labels</w:t>
+      </w:r>
+      <w:r>
+        <w:rPr>
+          <w:rFonts w:ascii="Consolas" w:eastAsia="Times New Roman" w:hAnsi="Consolas" w:cs="Times New Roman"/>
+          <w:color w:val="000000"/>
+          <w:kern w:val="0"/>
+          <w:sz w:val="21"/>
+          <w:szCs w:val="21"/>
+          <w:lang w:eastAsia="en-IN"/>
+          <w14:ligatures w14:val="none"/>
+        </w:rPr>
+        <w:t>=</w:t>
+      </w:r>
+      <w:proofErr w:type="spellStart"/>
+      <w:proofErr w:type="gramStart"/>
+      <w:r>
+        <w:rPr>
+          <w:rFonts w:ascii="Consolas" w:eastAsia="Times New Roman" w:hAnsi="Consolas" w:cs="Times New Roman"/>
+          <w:color w:val="001080"/>
+          <w:kern w:val="0"/>
+          <w:sz w:val="21"/>
+          <w:szCs w:val="21"/>
+          <w:lang w:eastAsia="en-IN"/>
+          <w14:ligatures w14:val="none"/>
+        </w:rPr>
+        <w:t>counts</w:t>
+      </w:r>
+      <w:r>
+        <w:rPr>
+          <w:rFonts w:ascii="Consolas" w:eastAsia="Times New Roman" w:hAnsi="Consolas" w:cs="Times New Roman"/>
+          <w:color w:val="000000"/>
+          <w:kern w:val="0"/>
+          <w:sz w:val="21"/>
+          <w:szCs w:val="21"/>
+          <w:lang w:eastAsia="en-IN"/>
+          <w14:ligatures w14:val="none"/>
+        </w:rPr>
+        <w:t>.</w:t>
+      </w:r>
+      <w:r>
+        <w:rPr>
+          <w:rFonts w:ascii="Consolas" w:eastAsia="Times New Roman" w:hAnsi="Consolas" w:cs="Times New Roman"/>
+          <w:color w:val="001080"/>
+          <w:kern w:val="0"/>
+          <w:sz w:val="21"/>
+          <w:szCs w:val="21"/>
+          <w:lang w:eastAsia="en-IN"/>
+          <w14:ligatures w14:val="none"/>
+        </w:rPr>
+        <w:t>index</w:t>
+      </w:r>
+      <w:proofErr w:type="spellEnd"/>
+      <w:proofErr w:type="gramEnd"/>
+      <w:r>
+        <w:rPr>
+          <w:rFonts w:ascii="Consolas" w:eastAsia="Times New Roman" w:hAnsi="Consolas" w:cs="Times New Roman"/>
+          <w:color w:val="001080"/>
+          <w:kern w:val="0"/>
+          <w:sz w:val="21"/>
+          <w:szCs w:val="21"/>
+          <w:lang w:eastAsia="en-IN"/>
+          <w14:ligatures w14:val="none"/>
+        </w:rPr>
+        <w:t xml:space="preserve">, </w:t>
+      </w:r>
+      <w:proofErr w:type="spellStart"/>
+      <w:r>
+        <w:rPr>
+          <w:rFonts w:ascii="Consolas" w:eastAsia="Times New Roman" w:hAnsi="Consolas" w:cs="Times New Roman"/>
+          <w:color w:val="001080"/>
+          <w:kern w:val="0"/>
+          <w:sz w:val="21"/>
+          <w:szCs w:val="21"/>
+          <w:lang w:eastAsia="en-IN"/>
+          <w14:ligatures w14:val="none"/>
+        </w:rPr>
+        <w:t>autopct</w:t>
+      </w:r>
+      <w:proofErr w:type="spellEnd"/>
+      <w:r>
+        <w:rPr>
+          <w:rFonts w:ascii="Consolas" w:eastAsia="Times New Roman" w:hAnsi="Consolas" w:cs="Times New Roman"/>
+          <w:color w:val="001080"/>
+          <w:kern w:val="0"/>
+          <w:sz w:val="21"/>
+          <w:szCs w:val="21"/>
+          <w:lang w:eastAsia="en-IN"/>
+          <w14:ligatures w14:val="none"/>
+        </w:rPr>
+        <w:t>='%1.1f%%'</w:t>
+      </w:r>
+      <w:r>
+        <w:rPr>
+          <w:rFonts w:ascii="Consolas" w:eastAsia="Times New Roman" w:hAnsi="Consolas" w:cs="Times New Roman"/>
+          <w:color w:val="000000"/>
+          <w:kern w:val="0"/>
+          <w:sz w:val="21"/>
+          <w:szCs w:val="21"/>
+          <w:lang w:eastAsia="en-IN"/>
+          <w14:ligatures w14:val="none"/>
+        </w:rPr>
+        <w:t xml:space="preserve">) </w:t>
+      </w:r>
+    </w:p>
+    <w:p>
+      <w:pPr>
+        <w:shd w:val="clear" w:color="auto" w:fill="FFFFFF"/>
+        <w:spacing w:after="0" w:line="285" w:lineRule="atLeast"/>
+        <w:ind w:left="567"/>
+        <w:rPr>
+          <w:rFonts w:ascii="Consolas" w:eastAsia="Times New Roman" w:hAnsi="Consolas" w:cs="Times New Roman"/>
+          <w:color w:val="000000"/>
+          <w:kern w:val="0"/>
+          <w:sz w:val="21"/>
+          <w:szCs w:val="21"/>
+          <w:lang w:eastAsia="en-IN"/>
+          <w14:ligatures w14:val="none"/>
+        </w:rPr>
+      </w:pPr>
+      <w:proofErr w:type="spellStart"/>
+      <w:proofErr w:type="gramStart"/>
+      <w:r>
+        <w:rPr>
+          <w:rFonts w:ascii="Consolas" w:eastAsia="Times New Roman" w:hAnsi="Consolas" w:cs="Times New Roman"/>
+          <w:color w:val="267F99"/>
+          <w:kern w:val="0"/>
+          <w:sz w:val="21"/>
+          <w:szCs w:val="21"/>
+          <w:lang w:eastAsia="en-IN"/>
+          <w14:ligatures w14:val="none"/>
+        </w:rPr>
+        <w:t>plt</w:t>
+      </w:r>
+      <w:r>
+        <w:rPr>
+          <w:rFonts w:ascii="Consolas" w:eastAsia="Times New Roman" w:hAnsi="Consolas" w:cs="Times New Roman"/>
+          <w:color w:val="000000"/>
+          <w:kern w:val="0"/>
+          <w:sz w:val="21"/>
+          <w:szCs w:val="21"/>
+          <w:lang w:eastAsia="en-IN"/>
+          <w14:ligatures w14:val="none"/>
+        </w:rPr>
+        <w:t>.</w:t>
+      </w:r>
+      <w:r>
+        <w:rPr>
+          <w:rFonts w:ascii="Consolas" w:eastAsia="Times New Roman" w:hAnsi="Consolas" w:cs="Times New Roman"/>
+          <w:color w:val="795E26"/>
+          <w:kern w:val="0"/>
+          <w:sz w:val="21"/>
+          <w:szCs w:val="21"/>
+          <w:lang w:eastAsia="en-IN"/>
+          <w14:ligatures w14:val="none"/>
+        </w:rPr>
+        <w:t>legend</w:t>
+      </w:r>
+      <w:proofErr w:type="spellEnd"/>
+      <w:proofErr w:type="gramEnd"/>
+      <w:r>
+        <w:rPr>
+          <w:rFonts w:ascii="Consolas" w:eastAsia="Times New Roman" w:hAnsi="Consolas" w:cs="Times New Roman"/>
+          <w:color w:val="000000"/>
+          <w:kern w:val="0"/>
+          <w:sz w:val="21"/>
+          <w:szCs w:val="21"/>
+          <w:lang w:eastAsia="en-IN"/>
+          <w14:ligatures w14:val="none"/>
+        </w:rPr>
+        <w:t>()</w:t>
+      </w:r>
+    </w:p>
+    <w:p>
+      <w:pPr>
+        <w:shd w:val="clear" w:color="auto" w:fill="FFFFFF"/>
+        <w:spacing w:after="0" w:line="285" w:lineRule="atLeast"/>
+        <w:ind w:left="567"/>
+        <w:rPr>
+          <w:rFonts w:ascii="Consolas" w:eastAsia="Times New Roman" w:hAnsi="Consolas" w:cs="Times New Roman"/>
+          <w:color w:val="000000"/>
+          <w:kern w:val="0"/>
+          <w:sz w:val="21"/>
+          <w:szCs w:val="21"/>
+          <w:lang w:eastAsia="en-IN"/>
+          <w14:ligatures w14:val="none"/>
+        </w:rPr>
+      </w:pPr>
+      <w:proofErr w:type="spellStart"/>
+      <w:proofErr w:type="gramStart"/>
+      <w:r>
+        <w:rPr>
+          <w:rFonts w:ascii="Consolas" w:eastAsia="Times New Roman" w:hAnsi="Consolas" w:cs="Times New Roman"/>
+          <w:color w:val="267F99"/>
+          <w:kern w:val="0"/>
+          <w:sz w:val="21"/>
+          <w:szCs w:val="21"/>
+          <w:lang w:eastAsia="en-IN"/>
+          <w14:ligatures w14:val="none"/>
+        </w:rPr>
+        <w:t>plt</w:t>
+      </w:r>
+      <w:r>
+        <w:rPr>
+          <w:rFonts w:ascii="Consolas" w:eastAsia="Times New Roman" w:hAnsi="Consolas" w:cs="Times New Roman"/>
+          <w:color w:val="000000"/>
+          <w:kern w:val="0"/>
+          <w:sz w:val="21"/>
+          <w:szCs w:val="21"/>
+          <w:lang w:eastAsia="en-IN"/>
+          <w14:ligatures w14:val="none"/>
+        </w:rPr>
+        <w:t>.</w:t>
+      </w:r>
+      <w:r>
+        <w:rPr>
+          <w:rFonts w:ascii="Consolas" w:eastAsia="Times New Roman" w:hAnsi="Consolas" w:cs="Times New Roman"/>
+          <w:color w:val="795E26"/>
+          <w:kern w:val="0"/>
+          <w:sz w:val="21"/>
+          <w:szCs w:val="21"/>
+          <w:lang w:eastAsia="en-IN"/>
+          <w14:ligatures w14:val="none"/>
+        </w:rPr>
+        <w:t>title</w:t>
+      </w:r>
+      <w:proofErr w:type="spellEnd"/>
+      <w:proofErr w:type="gramEnd"/>
+      <w:r>
+        <w:rPr>
+          <w:rFonts w:ascii="Consolas" w:eastAsia="Times New Roman" w:hAnsi="Consolas" w:cs="Times New Roman"/>
+          <w:color w:val="000000"/>
+          <w:kern w:val="0"/>
+          <w:sz w:val="21"/>
+          <w:szCs w:val="21"/>
+          <w:lang w:eastAsia="en-IN"/>
+          <w14:ligatures w14:val="none"/>
+        </w:rPr>
+        <w:t>(</w:t>
+      </w:r>
+      <w:r>
+        <w:rPr>
+          <w:rFonts w:ascii="Consolas" w:eastAsia="Times New Roman" w:hAnsi="Consolas" w:cs="Times New Roman"/>
+          <w:color w:val="A31515"/>
+          <w:kern w:val="0"/>
+          <w:sz w:val="21"/>
+          <w:szCs w:val="21"/>
+          <w:lang w:eastAsia="en-IN"/>
+          <w14:ligatures w14:val="none"/>
+        </w:rPr>
+        <w:t>"Gender Ratio"</w:t>
+      </w:r>
+      <w:r>
+        <w:rPr>
+          <w:rFonts w:ascii="Consolas" w:eastAsia="Times New Roman" w:hAnsi="Consolas" w:cs="Times New Roman"/>
+          <w:color w:val="000000"/>
+          <w:kern w:val="0"/>
+          <w:sz w:val="21"/>
+          <w:szCs w:val="21"/>
+          <w:lang w:eastAsia="en-IN"/>
+          <w14:ligatures w14:val="none"/>
+        </w:rPr>
+        <w:t>)</w:t>
+      </w:r>
+    </w:p>
+    <w:p>
+      <w:pPr>
+        <w:shd w:val="clear" w:color="auto" w:fill="FFFFFF"/>
+        <w:spacing w:after="0" w:line="285" w:lineRule="atLeast"/>
+        <w:ind w:left="567"/>
+        <w:rPr>
+          <w:rFonts w:ascii="Consolas" w:eastAsia="Times New Roman" w:hAnsi="Consolas" w:cs="Times New Roman"/>
+          <w:color w:val="000000"/>
+          <w:kern w:val="0"/>
+          <w:sz w:val="21"/>
+          <w:szCs w:val="21"/>
+          <w:lang w:eastAsia="en-IN"/>
+          <w14:ligatures w14:val="none"/>
+        </w:rPr>
+      </w:pPr>
+      <w:proofErr w:type="spellStart"/>
+      <w:proofErr w:type="gramStart"/>
+      <w:r>
+        <w:rPr>
+          <w:rFonts w:ascii="Consolas" w:eastAsia="Times New Roman" w:hAnsi="Consolas" w:cs="Times New Roman"/>
+          <w:color w:val="267F99"/>
+          <w:kern w:val="0"/>
+          <w:sz w:val="21"/>
+          <w:szCs w:val="21"/>
+          <w:lang w:eastAsia="en-IN"/>
+          <w14:ligatures w14:val="none"/>
+        </w:rPr>
+        <w:t>plt</w:t>
+      </w:r>
+      <w:r>
+        <w:rPr>
+          <w:rFonts w:ascii="Consolas" w:eastAsia="Times New Roman" w:hAnsi="Consolas" w:cs="Times New Roman"/>
+          <w:color w:val="000000"/>
+          <w:kern w:val="0"/>
+          <w:sz w:val="21"/>
+          <w:szCs w:val="21"/>
+          <w:lang w:eastAsia="en-IN"/>
+          <w14:ligatures w14:val="none"/>
+        </w:rPr>
+        <w:t>.</w:t>
+      </w:r>
+      <w:r>
+        <w:rPr>
+          <w:rFonts w:ascii="Consolas" w:eastAsia="Times New Roman" w:hAnsi="Consolas" w:cs="Times New Roman"/>
+          <w:color w:val="795E26"/>
+          <w:kern w:val="0"/>
+          <w:sz w:val="21"/>
+          <w:szCs w:val="21"/>
+          <w:lang w:eastAsia="en-IN"/>
+          <w14:ligatures w14:val="none"/>
+        </w:rPr>
+        <w:t>show</w:t>
+      </w:r>
+      <w:proofErr w:type="spellEnd"/>
+      <w:proofErr w:type="gramEnd"/>
+      <w:r>
+        <w:rPr>
+          <w:rFonts w:ascii="Consolas" w:eastAsia="Times New Roman" w:hAnsi="Consolas" w:cs="Times New Roman"/>
+          <w:color w:val="000000"/>
+          <w:kern w:val="0"/>
+          <w:sz w:val="21"/>
+          <w:szCs w:val="21"/>
+          <w:lang w:eastAsia="en-IN"/>
+          <w14:ligatures w14:val="none"/>
+        </w:rPr>
+        <w:t>()</w:t>
+      </w:r>
+    </w:p>
+    <w:p>
+      <w:pPr>
+        <w:pStyle w:val="ListParagraph"/>
+        <w:ind w:left="567"/>
+        <w:rPr>
+          <w:sz w:val="24"/>
+          <w:szCs w:val="24"/>
+          <w:lang w:val="en-US"/>
+        </w:rPr>
+      </w:pPr>
+    </w:p>
+    <w:p>
+      <w:pPr>
+        <w:rPr>
+          <w:sz w:val="24"/>
+          <w:szCs w:val="24"/>
+          <w:lang w:val="en-US"/>
+        </w:rPr>
+      </w:pPr>
+      <w:r>
+        <w:rPr>
+          <w:sz w:val="24"/>
+          <w:szCs w:val="24"/>
+          <w:lang w:val="en-US"/>
+        </w:rPr>
+        <w:tab/>
+        <w:t xml:space="preserve">Output: </w:t>
+      </w:r>
+    </w:p>
+    <w:p>
+      <w:pPr>
+        <w:rPr>
+          <w:sz w:val="28"/>
+          <w:szCs w:val="28"/>
+          <w:lang w:val="en-US"/>
+        </w:rPr>
+      </w:pPr>
+      <w:r>
+        <w:rPr>
+          <w:sz w:val="28"/>
+          <w:szCs w:val="28"/>
+          <w:lang w:val="en-US"/>
+        </w:rPr>
+        <w:drawing>
+          <wp:anchor distT="0" distB="0" distL="114300" distR="114300" simplePos="0" relativeHeight="251660288" behindDoc="0" locked="0" layoutInCell="1" allowOverlap="1" wp14:anchorId="31EDF3F5" wp14:editId="0835A327">
+            <wp:simplePos x="0" y="0"/>
+            <wp:positionH relativeFrom="column">
+              <wp:posOffset>341630</wp:posOffset>
+            </wp:positionH>
+            <wp:positionV relativeFrom="paragraph">
+              <wp:posOffset>16510</wp:posOffset>
+            </wp:positionV>
+            <wp:extent cx="2343785" cy="2476500"/>
+            <wp:effectExtent l="0" t="0" r="0" b="0"/>
+            <wp:wrapThrough wrapText="bothSides">
+              <wp:wrapPolygon edited="0">
+                <wp:start x="0" y="0"/>
+                <wp:lineTo x="0" y="21434"/>
+                <wp:lineTo x="21419" y="21434"/>
+                <wp:lineTo x="21419" y="0"/>
+                <wp:lineTo x="0" y="0"/>
+              </wp:wrapPolygon>
+            </wp:wrapThrough>
+            <wp:docPr id="723320251" name="Picture 1"/>
+            <wp:cNvGraphicFramePr>
+              <a:graphicFrameLocks xmlns:a="http://schemas.openxmlformats.org/drawingml/2006/main" noChangeAspect="1"/>
+            </wp:cNvGraphicFramePr>
+            <a:graphic xmlns:a="http://schemas.openxmlformats.org/drawingml/2006/main">
+              <a:graphicData uri="http://schemas.openxmlformats.org/drawingml/2006/picture">
+                <pic:pic xmlns:pic="http://schemas.openxmlformats.org/drawingml/2006/picture">
+                  <pic:nvPicPr>
+                    <pic:cNvPr id="723320251" name=""/>
+                    <pic:cNvPicPr/>
+                  </pic:nvPicPr>
+                  <pic:blipFill>
+                    <a:blip r:embed="rId10">
+                      <a:extLst>
+                        <a:ext uri="{28A0092B-C50C-407E-A947-70E740481C1C}">
+                          <a14:useLocalDpi xmlns:a14="http://schemas.microsoft.com/office/drawing/2010/main" val="0"/>
+                        </a:ext>
+                      </a:extLst>
+                    </a:blip>
+                    <a:stretch>
+                      <a:fillRect/>
+                    </a:stretch>
+                  </pic:blipFill>
+                  <pic:spPr>
+                    <a:xfrm>
+                      <a:off x="0" y="0"/>
+                      <a:ext cx="2343785" cy="2476500"/>
+                    </a:xfrm>
+                    <a:prstGeom prst="rect">
+                      <a:avLst/>
+                    </a:prstGeom>
+                  </pic:spPr>
+                </pic:pic>
+              </a:graphicData>
+            </a:graphic>
+            <wp14:sizeRelH relativeFrom="margin">
+              <wp14:pctWidth>0</wp14:pctWidth>
+            </wp14:sizeRelH>
+            <wp14:sizeRelV relativeFrom="margin">
+              <wp14:pctHeight>0</wp14:pctHeight>
+            </wp14:sizeRelV>
+          </wp:anchor>
+        </w:drawing>
+      </w:r>
+    </w:p>
+    <w:p>
+      <w:pPr>
+        <w:tabs>
+          <w:tab w:val="left" w:pos="2070"/>
+        </w:tabs>
+        <w:rPr>
+          <w:sz w:val="28"/>
+          <w:szCs w:val="28"/>
+          <w:lang w:val="en-US"/>
+        </w:rPr>
+      </w:pPr>
+      <w:r>
+        <w:rPr>
+          <w:sz w:val="28"/>
+          <w:szCs w:val="28"/>
+          <w:lang w:val="en-US"/>
+        </w:rPr>
+        <w:tab/>
+      </w:r>
+    </w:p>
+    <w:p>
+      <w:pPr>
+        <w:tabs>
+          <w:tab w:val="left" w:pos="2070"/>
+        </w:tabs>
+        <w:rPr>
+          <w:sz w:val="28"/>
+          <w:szCs w:val="28"/>
+          <w:lang w:val="en-US"/>
+        </w:rPr>
+      </w:pPr>
+    </w:p>
+    <w:p>
+      <w:pPr>
+        <w:tabs>
+          <w:tab w:val="left" w:pos="2070"/>
+        </w:tabs>
+        <w:rPr>
+          <w:sz w:val="28"/>
+          <w:szCs w:val="28"/>
+          <w:lang w:val="en-US"/>
+        </w:rPr>
+      </w:pPr>
+    </w:p>
+    <w:p>
+      <w:pPr>
+        <w:tabs>
+          <w:tab w:val="left" w:pos="2070"/>
+        </w:tabs>
+        <w:rPr>
+          <w:sz w:val="28"/>
+          <w:szCs w:val="28"/>
+          <w:lang w:val="en-US"/>
+        </w:rPr>
+      </w:pPr>
+    </w:p>
+    <w:p>
+      <w:pPr>
+        <w:tabs>
+          <w:tab w:val="left" w:pos="2070"/>
+        </w:tabs>
+        <w:rPr>
+          <w:sz w:val="28"/>
+          <w:szCs w:val="28"/>
+          <w:lang w:val="en-US"/>
+        </w:rPr>
+      </w:pPr>
+    </w:p>
+    <w:p>
+      <w:pPr>
+        <w:tabs>
+          <w:tab w:val="left" w:pos="2070"/>
+        </w:tabs>
+        <w:rPr>
+          <w:sz w:val="28"/>
+          <w:szCs w:val="28"/>
+          <w:lang w:val="en-US"/>
+        </w:rPr>
+      </w:pPr>
+    </w:p>
+    <w:p>
+      <w:pPr>
+        <w:tabs>
+          <w:tab w:val="left" w:pos="2070"/>
+        </w:tabs>
+        <w:rPr>
+          <w:sz w:val="28"/>
+          <w:szCs w:val="28"/>
+          <w:lang w:val="en-US"/>
+        </w:rPr>
+      </w:pPr>
+    </w:p>
+    <w:p>
+      <w:pPr>
+        <w:pStyle w:val="ListParagraph"/>
+        <w:numPr>
+          <w:ilvl w:val="0"/>
+          <w:numId w:val="2"/>
+        </w:numPr>
+        <w:tabs>
+          <w:tab w:val="left" w:pos="2070"/>
+        </w:tabs>
+        <w:ind w:left="567" w:hanging="283"/>
+        <w:rPr>
+          <w:sz w:val="24"/>
+          <w:szCs w:val="24"/>
+          <w:lang w:val="en-US"/>
+        </w:rPr>
+      </w:pPr>
+      <w:r>
+        <w:rPr>
+          <w:sz w:val="24"/>
+          <w:szCs w:val="24"/>
+          <w:lang w:val="en-US"/>
+        </w:rPr>
+        <w:t>Marks of each student</w:t>
+      </w:r>
+    </w:p>
+    <w:p>
+      <w:pPr>
+        <w:shd w:val="clear" w:color="auto" w:fill="FFFFFF"/>
+        <w:spacing w:after="0" w:line="285" w:lineRule="atLeast"/>
+        <w:ind w:left="567"/>
+        <w:rPr>
+          <w:rFonts w:ascii="Consolas" w:eastAsia="Times New Roman" w:hAnsi="Consolas" w:cs="Times New Roman"/>
+          <w:color w:val="000000"/>
+          <w:kern w:val="0"/>
+          <w:sz w:val="21"/>
+          <w:szCs w:val="21"/>
+          <w:lang w:eastAsia="en-IN"/>
+          <w14:ligatures w14:val="none"/>
+        </w:rPr>
+      </w:pPr>
+      <w:proofErr w:type="spellStart"/>
+      <w:proofErr w:type="gramStart"/>
+      <w:r>
+        <w:rPr>
+          <w:rFonts w:ascii="Consolas" w:eastAsia="Times New Roman" w:hAnsi="Consolas" w:cs="Times New Roman"/>
+          <w:color w:val="267F99"/>
+          <w:kern w:val="0"/>
+          <w:sz w:val="21"/>
+          <w:szCs w:val="21"/>
+          <w:lang w:eastAsia="en-IN"/>
+          <w14:ligatures w14:val="none"/>
+        </w:rPr>
+        <w:t>plt</w:t>
+      </w:r>
+      <w:r>
+        <w:rPr>
+          <w:rFonts w:ascii="Consolas" w:eastAsia="Times New Roman" w:hAnsi="Consolas" w:cs="Times New Roman"/>
+          <w:color w:val="000000"/>
+          <w:kern w:val="0"/>
+          <w:sz w:val="21"/>
+          <w:szCs w:val="21"/>
+          <w:lang w:eastAsia="en-IN"/>
+          <w14:ligatures w14:val="none"/>
+        </w:rPr>
+        <w:t>.</w:t>
+      </w:r>
+      <w:r>
+        <w:rPr>
+          <w:rFonts w:ascii="Consolas" w:eastAsia="Times New Roman" w:hAnsi="Consolas" w:cs="Times New Roman"/>
+          <w:color w:val="795E26"/>
+          <w:kern w:val="0"/>
+          <w:sz w:val="21"/>
+          <w:szCs w:val="21"/>
+          <w:lang w:eastAsia="en-IN"/>
+          <w14:ligatures w14:val="none"/>
+        </w:rPr>
+        <w:t>bar</w:t>
+      </w:r>
+      <w:proofErr w:type="spellEnd"/>
+      <w:r>
+        <w:rPr>
+          <w:rFonts w:ascii="Consolas" w:eastAsia="Times New Roman" w:hAnsi="Consolas" w:cs="Times New Roman"/>
+          <w:color w:val="000000"/>
+          <w:kern w:val="0"/>
+          <w:sz w:val="21"/>
+          <w:szCs w:val="21"/>
+          <w:lang w:eastAsia="en-IN"/>
+          <w14:ligatures w14:val="none"/>
+        </w:rPr>
+        <w:t>(</w:t>
+      </w:r>
+      <w:proofErr w:type="spellStart"/>
+      <w:proofErr w:type="gramEnd"/>
+      <w:r>
+        <w:rPr>
+          <w:rFonts w:ascii="Consolas" w:eastAsia="Times New Roman" w:hAnsi="Consolas" w:cs="Times New Roman"/>
+          <w:color w:val="001080"/>
+          <w:kern w:val="0"/>
+          <w:sz w:val="21"/>
+          <w:szCs w:val="21"/>
+          <w:lang w:eastAsia="en-IN"/>
+          <w14:ligatures w14:val="none"/>
+        </w:rPr>
+        <w:t>df_</w:t>
+      </w:r>
+      <w:proofErr w:type="gramStart"/>
+      <w:r>
+        <w:rPr>
+          <w:rFonts w:ascii="Consolas" w:eastAsia="Times New Roman" w:hAnsi="Consolas" w:cs="Times New Roman"/>
+          <w:color w:val="001080"/>
+          <w:kern w:val="0"/>
+          <w:sz w:val="21"/>
+          <w:szCs w:val="21"/>
+          <w:lang w:eastAsia="en-IN"/>
+          <w14:ligatures w14:val="none"/>
+        </w:rPr>
+        <w:t>student</w:t>
+      </w:r>
+      <w:r>
+        <w:rPr>
+          <w:rFonts w:ascii="Consolas" w:eastAsia="Times New Roman" w:hAnsi="Consolas" w:cs="Times New Roman"/>
+          <w:color w:val="000000"/>
+          <w:kern w:val="0"/>
+          <w:sz w:val="21"/>
+          <w:szCs w:val="21"/>
+          <w:lang w:eastAsia="en-IN"/>
+          <w14:ligatures w14:val="none"/>
+        </w:rPr>
+        <w:t>.</w:t>
+      </w:r>
+      <w:r>
+        <w:rPr>
+          <w:rFonts w:ascii="Consolas" w:eastAsia="Times New Roman" w:hAnsi="Consolas" w:cs="Times New Roman"/>
+          <w:color w:val="001080"/>
+          <w:kern w:val="0"/>
+          <w:sz w:val="21"/>
+          <w:szCs w:val="21"/>
+          <w:lang w:eastAsia="en-IN"/>
+          <w14:ligatures w14:val="none"/>
+        </w:rPr>
+        <w:t>Name</w:t>
+      </w:r>
+      <w:proofErr w:type="spellEnd"/>
+      <w:proofErr w:type="gramEnd"/>
+      <w:r>
+        <w:rPr>
+          <w:rFonts w:ascii="Consolas" w:eastAsia="Times New Roman" w:hAnsi="Consolas" w:cs="Times New Roman"/>
+          <w:color w:val="000000"/>
+          <w:kern w:val="0"/>
+          <w:sz w:val="21"/>
+          <w:szCs w:val="21"/>
+          <w:lang w:eastAsia="en-IN"/>
+          <w14:ligatures w14:val="none"/>
+        </w:rPr>
+        <w:t xml:space="preserve">, </w:t>
+      </w:r>
+      <w:proofErr w:type="spellStart"/>
+      <w:r>
+        <w:rPr>
+          <w:rFonts w:ascii="Consolas" w:eastAsia="Times New Roman" w:hAnsi="Consolas" w:cs="Times New Roman"/>
+          <w:color w:val="001080"/>
+          <w:kern w:val="0"/>
+          <w:sz w:val="21"/>
+          <w:szCs w:val="21"/>
+          <w:lang w:eastAsia="en-IN"/>
+          <w14:ligatures w14:val="none"/>
+        </w:rPr>
+        <w:t>df_</w:t>
+      </w:r>
+      <w:proofErr w:type="gramStart"/>
+      <w:r>
+        <w:rPr>
+          <w:rFonts w:ascii="Consolas" w:eastAsia="Times New Roman" w:hAnsi="Consolas" w:cs="Times New Roman"/>
+          <w:color w:val="001080"/>
+          <w:kern w:val="0"/>
+          <w:sz w:val="21"/>
+          <w:szCs w:val="21"/>
+          <w:lang w:eastAsia="en-IN"/>
+          <w14:ligatures w14:val="none"/>
+        </w:rPr>
+        <w:t>student</w:t>
+      </w:r>
+      <w:r>
+        <w:rPr>
+          <w:rFonts w:ascii="Consolas" w:eastAsia="Times New Roman" w:hAnsi="Consolas" w:cs="Times New Roman"/>
+          <w:color w:val="000000"/>
+          <w:kern w:val="0"/>
+          <w:sz w:val="21"/>
+          <w:szCs w:val="21"/>
+          <w:lang w:eastAsia="en-IN"/>
+          <w14:ligatures w14:val="none"/>
+        </w:rPr>
+        <w:t>.</w:t>
+      </w:r>
+      <w:r>
+        <w:rPr>
+          <w:rFonts w:ascii="Consolas" w:eastAsia="Times New Roman" w:hAnsi="Consolas" w:cs="Times New Roman"/>
+          <w:color w:val="001080"/>
+          <w:kern w:val="0"/>
+          <w:sz w:val="21"/>
+          <w:szCs w:val="21"/>
+          <w:lang w:eastAsia="en-IN"/>
+          <w14:ligatures w14:val="none"/>
+        </w:rPr>
+        <w:t>Marks</w:t>
+      </w:r>
+      <w:proofErr w:type="spellEnd"/>
+      <w:proofErr w:type="gramEnd"/>
+      <w:r>
+        <w:rPr>
+          <w:rFonts w:ascii="Consolas" w:eastAsia="Times New Roman" w:hAnsi="Consolas" w:cs="Times New Roman"/>
+          <w:color w:val="000000"/>
+          <w:kern w:val="0"/>
+          <w:sz w:val="21"/>
+          <w:szCs w:val="21"/>
+          <w:lang w:eastAsia="en-IN"/>
+          <w14:ligatures w14:val="none"/>
+        </w:rPr>
+        <w:t>)</w:t>
+      </w:r>
+    </w:p>
+    <w:p>
+      <w:pPr>
+        <w:shd w:val="clear" w:color="auto" w:fill="FFFFFF"/>
+        <w:spacing w:after="0" w:line="285" w:lineRule="atLeast"/>
+        <w:ind w:left="567"/>
+        <w:rPr>
+          <w:rFonts w:ascii="Consolas" w:eastAsia="Times New Roman" w:hAnsi="Consolas" w:cs="Times New Roman"/>
+          <w:color w:val="000000"/>
+          <w:kern w:val="0"/>
+          <w:sz w:val="21"/>
+          <w:szCs w:val="21"/>
+          <w:lang w:eastAsia="en-IN"/>
+          <w14:ligatures w14:val="none"/>
+        </w:rPr>
+      </w:pPr>
+      <w:proofErr w:type="spellStart"/>
+      <w:proofErr w:type="gramStart"/>
+      <w:r>
+        <w:rPr>
+          <w:rFonts w:ascii="Consolas" w:eastAsia="Times New Roman" w:hAnsi="Consolas" w:cs="Times New Roman"/>
+          <w:color w:val="267F99"/>
+          <w:kern w:val="0"/>
+          <w:sz w:val="21"/>
+          <w:szCs w:val="21"/>
+          <w:lang w:eastAsia="en-IN"/>
+          <w14:ligatures w14:val="none"/>
+        </w:rPr>
+        <w:t>plt</w:t>
+      </w:r>
+      <w:r>
+        <w:rPr>
+          <w:rFonts w:ascii="Consolas" w:eastAsia="Times New Roman" w:hAnsi="Consolas" w:cs="Times New Roman"/>
+          <w:color w:val="000000"/>
+          <w:kern w:val="0"/>
+          <w:sz w:val="21"/>
+          <w:szCs w:val="21"/>
+          <w:lang w:eastAsia="en-IN"/>
+          <w14:ligatures w14:val="none"/>
+        </w:rPr>
+        <w:t>.</w:t>
+      </w:r>
+      <w:r>
+        <w:rPr>
+          <w:rFonts w:ascii="Consolas" w:eastAsia="Times New Roman" w:hAnsi="Consolas" w:cs="Times New Roman"/>
+          <w:color w:val="795E26"/>
+          <w:kern w:val="0"/>
+          <w:sz w:val="21"/>
+          <w:szCs w:val="21"/>
+          <w:lang w:eastAsia="en-IN"/>
+          <w14:ligatures w14:val="none"/>
+        </w:rPr>
+        <w:t>ylabel</w:t>
+      </w:r>
+      <w:proofErr w:type="spellEnd"/>
+      <w:proofErr w:type="gramEnd"/>
+      <w:r>
+        <w:rPr>
+          <w:rFonts w:ascii="Consolas" w:eastAsia="Times New Roman" w:hAnsi="Consolas" w:cs="Times New Roman"/>
+          <w:color w:val="000000"/>
+          <w:kern w:val="0"/>
+          <w:sz w:val="21"/>
+          <w:szCs w:val="21"/>
+          <w:lang w:eastAsia="en-IN"/>
+          <w14:ligatures w14:val="none"/>
+        </w:rPr>
+        <w:t>(</w:t>
+      </w:r>
+      <w:r>
+        <w:rPr>
+          <w:rFonts w:ascii="Consolas" w:eastAsia="Times New Roman" w:hAnsi="Consolas" w:cs="Times New Roman"/>
+          <w:color w:val="A31515"/>
+          <w:kern w:val="0"/>
+          <w:sz w:val="21"/>
+          <w:szCs w:val="21"/>
+          <w:lang w:eastAsia="en-IN"/>
+          <w14:ligatures w14:val="none"/>
+        </w:rPr>
+        <w:t>"Marks"</w:t>
+      </w:r>
+      <w:r>
+        <w:rPr>
+          <w:rFonts w:ascii="Consolas" w:eastAsia="Times New Roman" w:hAnsi="Consolas" w:cs="Times New Roman"/>
+          <w:color w:val="000000"/>
+          <w:kern w:val="0"/>
+          <w:sz w:val="21"/>
+          <w:szCs w:val="21"/>
+          <w:lang w:eastAsia="en-IN"/>
+          <w14:ligatures w14:val="none"/>
+        </w:rPr>
+        <w:t>)</w:t>
+      </w:r>
+    </w:p>
+    <w:p>
+      <w:pPr>
+        <w:shd w:val="clear" w:color="auto" w:fill="FFFFFF"/>
+        <w:spacing w:after="0" w:line="285" w:lineRule="atLeast"/>
+        <w:ind w:left="567"/>
+        <w:rPr>
+          <w:rFonts w:ascii="Consolas" w:eastAsia="Times New Roman" w:hAnsi="Consolas" w:cs="Times New Roman"/>
+          <w:color w:val="000000"/>
+          <w:kern w:val="0"/>
+          <w:sz w:val="21"/>
+          <w:szCs w:val="21"/>
+          <w:lang w:eastAsia="en-IN"/>
+          <w14:ligatures w14:val="none"/>
+        </w:rPr>
+      </w:pPr>
+      <w:proofErr w:type="spellStart"/>
+      <w:proofErr w:type="gramStart"/>
+      <w:r>
+        <w:rPr>
+          <w:rFonts w:ascii="Consolas" w:eastAsia="Times New Roman" w:hAnsi="Consolas" w:cs="Times New Roman"/>
+          <w:color w:val="267F99"/>
+          <w:kern w:val="0"/>
+          <w:sz w:val="21"/>
+          <w:szCs w:val="21"/>
+          <w:lang w:eastAsia="en-IN"/>
+          <w14:ligatures w14:val="none"/>
+        </w:rPr>
+        <w:t>plt</w:t>
+      </w:r>
+      <w:r>
+        <w:rPr>
+          <w:rFonts w:ascii="Consolas" w:eastAsia="Times New Roman" w:hAnsi="Consolas" w:cs="Times New Roman"/>
+          <w:color w:val="000000"/>
+          <w:kern w:val="0"/>
+          <w:sz w:val="21"/>
+          <w:szCs w:val="21"/>
+          <w:lang w:eastAsia="en-IN"/>
+          <w14:ligatures w14:val="none"/>
+        </w:rPr>
+        <w:t>.</w:t>
+      </w:r>
+      <w:r>
+        <w:rPr>
+          <w:rFonts w:ascii="Consolas" w:eastAsia="Times New Roman" w:hAnsi="Consolas" w:cs="Times New Roman"/>
+          <w:color w:val="795E26"/>
+          <w:kern w:val="0"/>
+          <w:sz w:val="21"/>
+          <w:szCs w:val="21"/>
+          <w:lang w:eastAsia="en-IN"/>
+          <w14:ligatures w14:val="none"/>
+        </w:rPr>
+        <w:t>xlabel</w:t>
+      </w:r>
+      <w:proofErr w:type="spellEnd"/>
+      <w:proofErr w:type="gramEnd"/>
+      <w:r>
+        <w:rPr>
+          <w:rFonts w:ascii="Consolas" w:eastAsia="Times New Roman" w:hAnsi="Consolas" w:cs="Times New Roman"/>
+          <w:color w:val="000000"/>
+          <w:kern w:val="0"/>
+          <w:sz w:val="21"/>
+          <w:szCs w:val="21"/>
+          <w:lang w:eastAsia="en-IN"/>
+          <w14:ligatures w14:val="none"/>
+        </w:rPr>
+        <w:t>(</w:t>
+      </w:r>
+      <w:r>
+        <w:rPr>
+          <w:rFonts w:ascii="Consolas" w:eastAsia="Times New Roman" w:hAnsi="Consolas" w:cs="Times New Roman"/>
+          <w:color w:val="A31515"/>
+          <w:kern w:val="0"/>
+          <w:sz w:val="21"/>
+          <w:szCs w:val="21"/>
+          <w:lang w:eastAsia="en-IN"/>
+          <w14:ligatures w14:val="none"/>
+        </w:rPr>
+        <w:t>"Name"</w:t>
+      </w:r>
+      <w:r>
+        <w:rPr>
+          <w:rFonts w:ascii="Consolas" w:eastAsia="Times New Roman" w:hAnsi="Consolas" w:cs="Times New Roman"/>
+          <w:color w:val="000000"/>
+          <w:kern w:val="0"/>
+          <w:sz w:val="21"/>
+          <w:szCs w:val="21"/>
+          <w:lang w:eastAsia="en-IN"/>
+          <w14:ligatures w14:val="none"/>
+        </w:rPr>
+        <w:t>)</w:t>
+      </w:r>
+    </w:p>
+    <w:p>
+      <w:pPr>
+        <w:shd w:val="clear" w:color="auto" w:fill="FFFFFF"/>
+        <w:spacing w:after="0" w:line="285" w:lineRule="atLeast"/>
+        <w:ind w:left="567"/>
+        <w:rPr>
+          <w:rFonts w:ascii="Consolas" w:eastAsia="Times New Roman" w:hAnsi="Consolas" w:cs="Times New Roman"/>
+          <w:color w:val="000000"/>
+          <w:kern w:val="0"/>
+          <w:sz w:val="21"/>
+          <w:szCs w:val="21"/>
+          <w:lang w:eastAsia="en-IN"/>
+          <w14:ligatures w14:val="none"/>
+        </w:rPr>
+      </w:pPr>
+      <w:proofErr w:type="spellStart"/>
+      <w:proofErr w:type="gramStart"/>
+      <w:r>
+        <w:rPr>
+          <w:rFonts w:ascii="Consolas" w:eastAsia="Times New Roman" w:hAnsi="Consolas" w:cs="Times New Roman"/>
+          <w:color w:val="267F99"/>
+          <w:kern w:val="0"/>
+          <w:sz w:val="21"/>
+          <w:szCs w:val="21"/>
+          <w:lang w:eastAsia="en-IN"/>
+          <w14:ligatures w14:val="none"/>
+        </w:rPr>
+        <w:t>plt</w:t>
+      </w:r>
+      <w:r>
+        <w:rPr>
+          <w:rFonts w:ascii="Consolas" w:eastAsia="Times New Roman" w:hAnsi="Consolas" w:cs="Times New Roman"/>
+          <w:color w:val="000000"/>
+          <w:kern w:val="0"/>
+          <w:sz w:val="21"/>
+          <w:szCs w:val="21"/>
+          <w:lang w:eastAsia="en-IN"/>
+          <w14:ligatures w14:val="none"/>
+        </w:rPr>
+        <w:t>.</w:t>
+      </w:r>
+      <w:r>
+        <w:rPr>
+          <w:rFonts w:ascii="Consolas" w:eastAsia="Times New Roman" w:hAnsi="Consolas" w:cs="Times New Roman"/>
+          <w:color w:val="795E26"/>
+          <w:kern w:val="0"/>
+          <w:sz w:val="21"/>
+          <w:szCs w:val="21"/>
+          <w:lang w:eastAsia="en-IN"/>
+          <w14:ligatures w14:val="none"/>
+        </w:rPr>
+        <w:t>xticks</w:t>
+      </w:r>
+      <w:proofErr w:type="spellEnd"/>
+      <w:proofErr w:type="gramEnd"/>
+      <w:r>
+        <w:rPr>
+          <w:rFonts w:ascii="Consolas" w:eastAsia="Times New Roman" w:hAnsi="Consolas" w:cs="Times New Roman"/>
+          <w:color w:val="000000"/>
+          <w:kern w:val="0"/>
+          <w:sz w:val="21"/>
+          <w:szCs w:val="21"/>
+          <w:lang w:eastAsia="en-IN"/>
+          <w14:ligatures w14:val="none"/>
+        </w:rPr>
+        <w:t>(</w:t>
+      </w:r>
+      <w:r>
+        <w:rPr>
+          <w:rFonts w:ascii="Consolas" w:eastAsia="Times New Roman" w:hAnsi="Consolas" w:cs="Times New Roman"/>
+          <w:color w:val="001080"/>
+          <w:kern w:val="0"/>
+          <w:sz w:val="21"/>
+          <w:szCs w:val="21"/>
+          <w:lang w:eastAsia="en-IN"/>
+          <w14:ligatures w14:val="none"/>
+        </w:rPr>
+        <w:t>rotation</w:t>
+      </w:r>
+      <w:r>
+        <w:rPr>
+          <w:rFonts w:ascii="Consolas" w:eastAsia="Times New Roman" w:hAnsi="Consolas" w:cs="Times New Roman"/>
+          <w:color w:val="000000"/>
+          <w:kern w:val="0"/>
+          <w:sz w:val="21"/>
+          <w:szCs w:val="21"/>
+          <w:lang w:eastAsia="en-IN"/>
+          <w14:ligatures w14:val="none"/>
+        </w:rPr>
+        <w:t>=</w:t>
+      </w:r>
+      <w:r>
+        <w:rPr>
+          <w:rFonts w:ascii="Consolas" w:eastAsia="Times New Roman" w:hAnsi="Consolas" w:cs="Times New Roman"/>
+          <w:color w:val="098658"/>
+          <w:kern w:val="0"/>
+          <w:sz w:val="21"/>
+          <w:szCs w:val="21"/>
+          <w:lang w:eastAsia="en-IN"/>
+          <w14:ligatures w14:val="none"/>
+        </w:rPr>
+        <w:t>90</w:t>
+      </w:r>
+      <w:r>
+        <w:rPr>
+          <w:rFonts w:ascii="Consolas" w:eastAsia="Times New Roman" w:hAnsi="Consolas" w:cs="Times New Roman"/>
+          <w:color w:val="000000"/>
+          <w:kern w:val="0"/>
+          <w:sz w:val="21"/>
+          <w:szCs w:val="21"/>
+          <w:lang w:eastAsia="en-IN"/>
+          <w14:ligatures w14:val="none"/>
+        </w:rPr>
+        <w:t>)</w:t>
+      </w:r>
+    </w:p>
+    <w:p>
+      <w:pPr>
+        <w:shd w:val="clear" w:color="auto" w:fill="FFFFFF"/>
+        <w:spacing w:after="0" w:line="285" w:lineRule="atLeast"/>
+        <w:ind w:left="567"/>
+        <w:rPr>
+          <w:rFonts w:ascii="Consolas" w:eastAsia="Times New Roman" w:hAnsi="Consolas" w:cs="Times New Roman"/>
+          <w:color w:val="000000"/>
+          <w:kern w:val="0"/>
+          <w:sz w:val="21"/>
+          <w:szCs w:val="21"/>
+          <w:lang w:eastAsia="en-IN"/>
+          <w14:ligatures w14:val="none"/>
+        </w:rPr>
+      </w:pPr>
+      <w:proofErr w:type="spellStart"/>
+      <w:proofErr w:type="gramStart"/>
+      <w:r>
+        <w:rPr>
+          <w:rFonts w:ascii="Consolas" w:eastAsia="Times New Roman" w:hAnsi="Consolas" w:cs="Times New Roman"/>
+          <w:color w:val="267F99"/>
+          <w:kern w:val="0"/>
+          <w:sz w:val="21"/>
+          <w:szCs w:val="21"/>
+          <w:lang w:eastAsia="en-IN"/>
+          <w14:ligatures w14:val="none"/>
+        </w:rPr>
+        <w:t>plt</w:t>
+      </w:r>
+      <w:r>
+        <w:rPr>
+          <w:rFonts w:ascii="Consolas" w:eastAsia="Times New Roman" w:hAnsi="Consolas" w:cs="Times New Roman"/>
+          <w:color w:val="000000"/>
+          <w:kern w:val="0"/>
+          <w:sz w:val="21"/>
+          <w:szCs w:val="21"/>
+          <w:lang w:eastAsia="en-IN"/>
+          <w14:ligatures w14:val="none"/>
+        </w:rPr>
+        <w:t>.</w:t>
+      </w:r>
+      <w:r>
+        <w:rPr>
+          <w:rFonts w:ascii="Consolas" w:eastAsia="Times New Roman" w:hAnsi="Consolas" w:cs="Times New Roman"/>
+          <w:color w:val="795E26"/>
+          <w:kern w:val="0"/>
+          <w:sz w:val="21"/>
+          <w:szCs w:val="21"/>
+          <w:lang w:eastAsia="en-IN"/>
+          <w14:ligatures w14:val="none"/>
+        </w:rPr>
+        <w:t>show</w:t>
+      </w:r>
+      <w:proofErr w:type="spellEnd"/>
+      <w:proofErr w:type="gramEnd"/>
+      <w:r>
+        <w:rPr>
+          <w:rFonts w:ascii="Consolas" w:eastAsia="Times New Roman" w:hAnsi="Consolas" w:cs="Times New Roman"/>
+          <w:color w:val="000000"/>
+          <w:kern w:val="0"/>
+          <w:sz w:val="21"/>
+          <w:szCs w:val="21"/>
+          <w:lang w:eastAsia="en-IN"/>
+          <w14:ligatures w14:val="none"/>
+        </w:rPr>
+        <w:t>()</w:t>
+      </w:r>
+    </w:p>
+    <w:p>
+      <w:pPr>
+        <w:pStyle w:val="ListParagraph"/>
+        <w:tabs>
+          <w:tab w:val="left" w:pos="2070"/>
+        </w:tabs>
+        <w:ind w:left="567"/>
+        <w:rPr>
+          <w:sz w:val="24"/>
+          <w:szCs w:val="24"/>
+          <w:lang w:val="en-US"/>
+        </w:rPr>
+      </w:pPr>
+    </w:p>
+    <w:p>
+      <w:pPr>
+        <w:pStyle w:val="ListParagraph"/>
+        <w:tabs>
+          <w:tab w:val="left" w:pos="2070"/>
+        </w:tabs>
+        <w:ind w:left="567"/>
+        <w:rPr>
+          <w:sz w:val="24"/>
+          <w:szCs w:val="24"/>
+          <w:lang w:val="en-US"/>
+        </w:rPr>
+      </w:pPr>
+    </w:p>
+    <w:p>
+      <w:pPr>
+        <w:pStyle w:val="ListParagraph"/>
+        <w:tabs>
+          <w:tab w:val="left" w:pos="2070"/>
+        </w:tabs>
+        <w:ind w:left="567"/>
+        <w:rPr>
+          <w:sz w:val="24"/>
+          <w:szCs w:val="24"/>
+          <w:lang w:val="en-US"/>
+        </w:rPr>
+      </w:pPr>
+    </w:p>
+    <w:p>
+      <w:pPr>
+        <w:pStyle w:val="ListParagraph"/>
+        <w:tabs>
+          <w:tab w:val="left" w:pos="2070"/>
+        </w:tabs>
+        <w:ind w:left="567"/>
+        <w:rPr>
+          <w:sz w:val="24"/>
+          <w:szCs w:val="24"/>
+          <w:lang w:val="en-US"/>
+        </w:rPr>
+      </w:pPr>
+    </w:p>
+    <w:p>
+      <w:pPr>
+        <w:pStyle w:val="ListParagraph"/>
+        <w:tabs>
+          <w:tab w:val="left" w:pos="2070"/>
+        </w:tabs>
+        <w:ind w:left="567"/>
+        <w:rPr>
+          <w:sz w:val="24"/>
+          <w:szCs w:val="24"/>
+          <w:lang w:val="en-US"/>
+        </w:rPr>
+      </w:pPr>
+    </w:p>
+    <w:p>
+      <w:pPr>
+        <w:pStyle w:val="ListParagraph"/>
+        <w:tabs>
+          <w:tab w:val="left" w:pos="2070"/>
+        </w:tabs>
+        <w:ind w:left="567"/>
+        <w:rPr>
+          <w:sz w:val="24"/>
+          <w:szCs w:val="24"/>
+          <w:lang w:val="en-US"/>
+        </w:rPr>
+      </w:pPr>
+    </w:p>
+    <w:p>
+      <w:pPr>
+        <w:pStyle w:val="ListParagraph"/>
+        <w:tabs>
+          <w:tab w:val="left" w:pos="2070"/>
+        </w:tabs>
+        <w:ind w:left="567"/>
+        <w:rPr>
+          <w:sz w:val="24"/>
+          <w:szCs w:val="24"/>
+          <w:lang w:val="en-US"/>
+        </w:rPr>
+      </w:pPr>
+    </w:p>
+    <w:p>
+      <w:pPr>
+        <w:pStyle w:val="ListParagraph"/>
+        <w:tabs>
+          <w:tab w:val="left" w:pos="2070"/>
+        </w:tabs>
+        <w:ind w:left="567"/>
+        <w:rPr>
+          <w:sz w:val="24"/>
+          <w:szCs w:val="24"/>
+          <w:lang w:val="en-US"/>
+        </w:rPr>
+      </w:pPr>
+    </w:p>
+    <w:p>
+      <w:pPr>
+        <w:pStyle w:val="ListParagraph"/>
+        <w:tabs>
+          <w:tab w:val="left" w:pos="2070"/>
+        </w:tabs>
+        <w:ind w:left="567"/>
+        <w:rPr>
+          <w:sz w:val="24"/>
+          <w:szCs w:val="24"/>
+          <w:lang w:val="en-US"/>
+        </w:rPr>
+      </w:pPr>
+      <w:r>
+        <w:rPr>
+          <w:lang w:val="en-US"/>
+        </w:rPr>
+        <w:drawing>
+          <wp:anchor distT="0" distB="0" distL="114300" distR="114300" simplePos="0" relativeHeight="251661312" behindDoc="0" locked="0" layoutInCell="1" allowOverlap="1" wp14:anchorId="4F5044E6" wp14:editId="04F740AD">
+            <wp:simplePos x="0" y="0"/>
+            <wp:positionH relativeFrom="column">
+              <wp:posOffset>238125</wp:posOffset>
+            </wp:positionH>
+            <wp:positionV relativeFrom="paragraph">
+              <wp:posOffset>295275</wp:posOffset>
+            </wp:positionV>
+            <wp:extent cx="4327525" cy="3648075"/>
+            <wp:effectExtent l="0" t="0" r="0" b="9525"/>
+            <wp:wrapThrough wrapText="bothSides">
+              <wp:wrapPolygon edited="0">
+                <wp:start x="0" y="0"/>
+                <wp:lineTo x="0" y="21544"/>
+                <wp:lineTo x="21489" y="21544"/>
+                <wp:lineTo x="21489" y="0"/>
+                <wp:lineTo x="0" y="0"/>
+              </wp:wrapPolygon>
+            </wp:wrapThrough>
+            <wp:docPr id="1672459204" name="Picture 1"/>
+            <wp:cNvGraphicFramePr>
+              <a:graphicFrameLocks xmlns:a="http://schemas.openxmlformats.org/drawingml/2006/main" noChangeAspect="1"/>
+            </wp:cNvGraphicFramePr>
+            <a:graphic xmlns:a="http://schemas.openxmlformats.org/drawingml/2006/main">
+              <a:graphicData uri="http://schemas.openxmlformats.org/drawingml/2006/picture">
+                <pic:pic xmlns:pic="http://schemas.openxmlformats.org/drawingml/2006/picture">
+                  <pic:nvPicPr>
+                    <pic:cNvPr id="1672459204" name=""/>
+                    <pic:cNvPicPr/>
+                  </pic:nvPicPr>
+                  <pic:blipFill>
+                    <a:blip r:embed="rId11">
+                      <a:extLst>
+                        <a:ext uri="{28A0092B-C50C-407E-A947-70E740481C1C}">
+                          <a14:useLocalDpi xmlns:a14="http://schemas.microsoft.com/office/drawing/2010/main" val="0"/>
+                        </a:ext>
+                      </a:extLst>
+                    </a:blip>
+                    <a:stretch>
+                      <a:fillRect/>
+                    </a:stretch>
+                  </pic:blipFill>
+                  <pic:spPr>
+                    <a:xfrm>
+                      <a:off x="0" y="0"/>
+                      <a:ext cx="4327525" cy="3648075"/>
+                    </a:xfrm>
+                    <a:prstGeom prst="rect">
+                      <a:avLst/>
+                    </a:prstGeom>
+                  </pic:spPr>
+                </pic:pic>
+              </a:graphicData>
+            </a:graphic>
+            <wp14:sizeRelH relativeFrom="margin">
+              <wp14:pctWidth>0</wp14:pctWidth>
+            </wp14:sizeRelH>
+            <wp14:sizeRelV relativeFrom="margin">
+              <wp14:pctHeight>0</wp14:pctHeight>
+            </wp14:sizeRelV>
+          </wp:anchor>
+        </w:drawing>
+      </w:r>
+      <w:r>
+        <w:rPr>
+          <w:sz w:val="24"/>
+          <w:szCs w:val="24"/>
+          <w:lang w:val="en-US"/>
+        </w:rPr>
+        <w:t xml:space="preserve">output: </w:t>
+      </w:r>
+    </w:p>
+    <w:p>
+      <w:pPr>
+        <w:rPr>
+          <w:sz w:val="24"/>
+          <w:szCs w:val="24"/>
+          <w:lang w:val="en-US"/>
+        </w:rPr>
+      </w:pPr>
+      <w:r>
+        <w:rPr>
+          <w:sz w:val="24"/>
+          <w:szCs w:val="24"/>
+          <w:lang w:val="en-US"/>
+        </w:rPr>
+        <w:br w:type="page"/>
+      </w:r>
+    </w:p>
+    <w:p>
+      <w:pPr>
+        <w:pStyle w:val="Title"/>
+        <w:rPr>
+          <w:lang w:val="en-US"/>
+        </w:rPr>
+      </w:pPr>
+      <w:r>
+        <w:rPr>
+          <w:lang w:val="en-US"/>
+        </w:rPr>
+        <w:t>Experiment 2</w:t>
+      </w:r>
+    </w:p>
+    <w:p>
+      <w:pPr>
         <w:rPr>
           <w:b/>
           <w:bCs/>
-          <w:sz w:val="32"/>
-          <w:szCs w:val="32"/>
-          <w:lang w:val="en-US"/>
-        </w:rPr>
-        <w:t>such as numerical and categorical). Analyze the dataset and present it using suitable tables or charts.</w:t>
-      </w:r>
-    </w:p>
-    <w:p>
-      <w:pPr>
-        <w:jc w:val="both"/>
+          <w:sz w:val="28"/>
+          <w:szCs w:val="28"/>
+          <w:lang w:val="en-US"/>
+        </w:rPr>
+      </w:pPr>
+      <w:r>
         <w:rPr>
           <w:b/>
           <w:bCs/>
-          <w:sz w:val="32"/>
-          <w:szCs w:val="32"/>
-          <w:lang w:val="en-US"/>
-        </w:rPr>
-      </w:pPr>
-    </w:p>
-    <w:p>
-      <w:pPr>
-        <w:jc w:val="both"/>
-        <w:rPr>
           <w:sz w:val="28"/>
           <w:szCs w:val="28"/>
           <w:lang w:val="en-US"/>
         </w:rPr>
-      </w:pPr>
+        <w:t xml:space="preserve">Take a dataset and classify the data based on measurement </w:t>
+      </w:r>
       <w:proofErr w:type="gramStart"/>
       <w:r>
         <w:rPr>
+          <w:b/>
+          <w:bCs/>
           <w:sz w:val="28"/>
           <w:szCs w:val="28"/>
           <w:lang w:val="en-US"/>
         </w:rPr>
-        <w:t>Sure</w:t>
+        <w:t>scales(</w:t>
       </w:r>
       <w:proofErr w:type="gramEnd"/>
       <w:r>
         <w:rPr>
+          <w:b/>
+          <w:bCs/>
           <w:sz w:val="28"/>
           <w:szCs w:val="28"/>
           <w:lang w:val="en-US"/>
         </w:rPr>
-        <w:t xml:space="preserve"> let me get these</w:t>
+        <w:t>nominal, ordinal, interval, and ratio). Provide appropriate examples for each category.</w:t>
+      </w:r>
+    </w:p>
+    <w:p>
+      <w:pPr>
+        <w:rPr>
+          <w:b/>
+          <w:bCs/>
+          <w:sz w:val="28"/>
+          <w:szCs w:val="28"/>
+          <w:lang w:val="en-US"/>
+        </w:rPr>
+      </w:pPr>
+    </w:p>
+    <w:p>
+      <w:pPr>
+        <w:rPr>
+          <w:sz w:val="24"/>
+          <w:szCs w:val="24"/>
+          <w:lang w:val="en-US"/>
+        </w:rPr>
+      </w:pPr>
+      <w:r>
+        <w:rPr>
+          <w:sz w:val="24"/>
+          <w:szCs w:val="24"/>
+          <w:lang w:val="en-US"/>
+        </w:rPr>
+        <w:t>Classification Table:</w:t>
+      </w:r>
+    </w:p>
+    <w:p>
+      <w:pPr>
+        <w:rPr>
+          <w:sz w:val="24"/>
+          <w:szCs w:val="24"/>
+          <w:lang w:val="en-US"/>
+        </w:rPr>
+      </w:pPr>
+      <w:r>
+        <w:rPr>
+          <w:sz w:val="24"/>
+          <w:szCs w:val="24"/>
+          <w:lang w:val="en-US"/>
+        </w:rPr>
+        <w:t>printout: 3, 4, 5, 6, 7, 12, 13, 14,</w:t>
       </w:r>
     </w:p>
     <w:sectPr>
-      <w:footerReference w:type="default" r:id="rId7"/>
+      <w:footerReference w:type="default" r:id="rId12"/>
       <w:pgSz w:w="11906" w:h="16838"/>
       <w:pgMar w:top="1440" w:right="1440" w:bottom="1440" w:left="1440" w:header="708" w:footer="708" w:gutter="0"/>
       <w:cols w:space="708"/>
@@ -212,6 +3151,195 @@
     </w:p>
   </w:footnote>
 </w:footnotes>
+</file>
+
+<file path=word/numbering.xml><?xml version="1.0" encoding="utf-8"?>
+<w:numbering xmlns:wpc="http://schemas.microsoft.com/office/word/2010/wordprocessingCanvas" xmlns:cx="http://schemas.microsoft.com/office/drawing/2014/chartex" xmlns:cx1="http://schemas.microsoft.com/office/drawing/2015/9/8/chartex" xmlns:cx2="http://schemas.microsoft.com/office/drawing/2015/10/21/chartex" xmlns:cx3="http://schemas.microsoft.com/office/drawing/2016/5/9/chartex" xmlns:cx4="http://schemas.microsoft.com/office/drawing/2016/5/10/chartex" xmlns:cx5="http://schemas.microsoft.com/office/drawing/2016/5/11/chartex" xmlns:cx6="http://schemas.microsoft.com/office/drawing/2016/5/12/chartex" xmlns:cx7="http://schemas.microsoft.com/office/drawing/2016/5/13/chartex" xmlns:cx8="http://schemas.microsoft.com/office/drawing/2016/5/14/chartex" xmlns:mc="http://schemas.openxmlformats.org/markup-compatibility/2006" xmlns:aink="http://schemas.microsoft.com/office/drawing/2016/ink" xmlns:am3d="http://schemas.microsoft.com/office/drawing/2017/model3d" xmlns:o="urn:schemas-microsoft-com:office:office" xmlns:oel="http://schemas.microsoft.com/office/2019/extlst" xmlns:r="http://schemas.openxmlformats.org/officeDocument/2006/relationships" xmlns:m="http://schemas.openxmlformats.org/officeDocument/2006/math" xmlns:v="urn:schemas-microsoft-com:vml" xmlns:wp14="http://schemas.microsoft.com/office/word/2010/wordprocessingDrawing" xmlns:wp="http://schemas.openxmlformats.org/drawingml/2006/wordprocessingDrawing" xmlns:w10="urn:schemas-microsoft-com:office:word" xmlns:w="http://schemas.openxmlformats.org/wordprocessingml/2006/main" xmlns:w14="http://schemas.microsoft.com/office/word/2010/wordml" xmlns:w15="http://schemas.microsoft.com/office/word/2012/wordml" xmlns:w16cex="http://schemas.microsoft.com/office/word/2018/wordml/cex" xmlns:w16cid="http://schemas.microsoft.com/office/word/2016/wordml/cid" xmlns:w16="http://schemas.microsoft.com/office/word/2018/wordml" xmlns:w16du="http://schemas.microsoft.com/office/word/2023/wordml/word16du" xmlns:w16sdtdh="http://schemas.microsoft.com/office/word/2020/wordml/sdtdatahash" xmlns:w16sdtfl="http://schemas.microsoft.com/office/word/2024/wordml/sdtformatlock" xmlns:w16se="http://schemas.microsoft.com/office/word/2015/wordml/symex" xmlns:wpg="http://schemas.microsoft.com/office/word/2010/wordprocessingGroup" xmlns:wpi="http://schemas.microsoft.com/office/word/2010/wordprocessingInk" xmlns:wne="http://schemas.microsoft.com/office/word/2006/wordml" xmlns:wps="http://schemas.microsoft.com/office/word/2010/wordprocessingShape" mc:Ignorable="w14 w15 w16se w16cid w16 w16cex w16sdtdh w16sdtfl w16du wp14">
+  <w:abstractNum w:abstractNumId="0" w15:restartNumberingAfterBreak="0">
+    <w:nsid w:val="0BBD7695"/>
+    <w:multiLevelType w:val="hybridMultilevel"/>
+    <w:tmpl w:val="E0304EB0"/>
+    <w:lvl w:ilvl="0" w:tplc="8F3A2496">
+      <w:start w:val="1"/>
+      <w:numFmt w:val="lowerRoman"/>
+      <w:lvlText w:val="%1)"/>
+      <w:lvlJc w:val="left"/>
+      <w:pPr>
+        <w:ind w:left="1080" w:hanging="720"/>
+      </w:pPr>
+      <w:rPr>
+        <w:rFonts w:hint="default"/>
+      </w:rPr>
+    </w:lvl>
+    <w:lvl w:ilvl="1" w:tplc="40090019" w:tentative="1">
+      <w:start w:val="1"/>
+      <w:numFmt w:val="lowerLetter"/>
+      <w:lvlText w:val="%2."/>
+      <w:lvlJc w:val="left"/>
+      <w:pPr>
+        <w:ind w:left="1440" w:hanging="360"/>
+      </w:pPr>
+    </w:lvl>
+    <w:lvl w:ilvl="2" w:tplc="4009001B" w:tentative="1">
+      <w:start w:val="1"/>
+      <w:numFmt w:val="lowerRoman"/>
+      <w:lvlText w:val="%3."/>
+      <w:lvlJc w:val="right"/>
+      <w:pPr>
+        <w:ind w:left="2160" w:hanging="180"/>
+      </w:pPr>
+    </w:lvl>
+    <w:lvl w:ilvl="3" w:tplc="4009000F" w:tentative="1">
+      <w:start w:val="1"/>
+      <w:numFmt w:val="decimal"/>
+      <w:lvlText w:val="%4."/>
+      <w:lvlJc w:val="left"/>
+      <w:pPr>
+        <w:ind w:left="2880" w:hanging="360"/>
+      </w:pPr>
+    </w:lvl>
+    <w:lvl w:ilvl="4" w:tplc="40090019" w:tentative="1">
+      <w:start w:val="1"/>
+      <w:numFmt w:val="lowerLetter"/>
+      <w:lvlText w:val="%5."/>
+      <w:lvlJc w:val="left"/>
+      <w:pPr>
+        <w:ind w:left="3600" w:hanging="360"/>
+      </w:pPr>
+    </w:lvl>
+    <w:lvl w:ilvl="5" w:tplc="4009001B" w:tentative="1">
+      <w:start w:val="1"/>
+      <w:numFmt w:val="lowerRoman"/>
+      <w:lvlText w:val="%6."/>
+      <w:lvlJc w:val="right"/>
+      <w:pPr>
+        <w:ind w:left="4320" w:hanging="180"/>
+      </w:pPr>
+    </w:lvl>
+    <w:lvl w:ilvl="6" w:tplc="4009000F" w:tentative="1">
+      <w:start w:val="1"/>
+      <w:numFmt w:val="decimal"/>
+      <w:lvlText w:val="%7."/>
+      <w:lvlJc w:val="left"/>
+      <w:pPr>
+        <w:ind w:left="5040" w:hanging="360"/>
+      </w:pPr>
+    </w:lvl>
+    <w:lvl w:ilvl="7" w:tplc="40090019" w:tentative="1">
+      <w:start w:val="1"/>
+      <w:numFmt w:val="lowerLetter"/>
+      <w:lvlText w:val="%8."/>
+      <w:lvlJc w:val="left"/>
+      <w:pPr>
+        <w:ind w:left="5760" w:hanging="360"/>
+      </w:pPr>
+    </w:lvl>
+    <w:lvl w:ilvl="8" w:tplc="4009001B" w:tentative="1">
+      <w:start w:val="1"/>
+      <w:numFmt w:val="lowerRoman"/>
+      <w:lvlText w:val="%9."/>
+      <w:lvlJc w:val="right"/>
+      <w:pPr>
+        <w:ind w:left="6480" w:hanging="180"/>
+      </w:pPr>
+    </w:lvl>
+  </w:abstractNum>
+  <w:abstractNum w:abstractNumId="1" w15:restartNumberingAfterBreak="0">
+    <w:nsid w:val="242545F5"/>
+    <w:multiLevelType w:val="hybridMultilevel"/>
+    <w:tmpl w:val="588AF712"/>
+    <w:lvl w:ilvl="0" w:tplc="4009000F">
+      <w:start w:val="1"/>
+      <w:numFmt w:val="decimal"/>
+      <w:lvlText w:val="%1."/>
+      <w:lvlJc w:val="left"/>
+      <w:pPr>
+        <w:ind w:left="720" w:hanging="360"/>
+      </w:pPr>
+      <w:rPr>
+        <w:rFonts w:hint="default"/>
+      </w:rPr>
+    </w:lvl>
+    <w:lvl w:ilvl="1" w:tplc="40090019" w:tentative="1">
+      <w:start w:val="1"/>
+      <w:numFmt w:val="lowerLetter"/>
+      <w:lvlText w:val="%2."/>
+      <w:lvlJc w:val="left"/>
+      <w:pPr>
+        <w:ind w:left="1440" w:hanging="360"/>
+      </w:pPr>
+    </w:lvl>
+    <w:lvl w:ilvl="2" w:tplc="4009001B" w:tentative="1">
+      <w:start w:val="1"/>
+      <w:numFmt w:val="lowerRoman"/>
+      <w:lvlText w:val="%3."/>
+      <w:lvlJc w:val="right"/>
+      <w:pPr>
+        <w:ind w:left="2160" w:hanging="180"/>
+      </w:pPr>
+    </w:lvl>
+    <w:lvl w:ilvl="3" w:tplc="4009000F" w:tentative="1">
+      <w:start w:val="1"/>
+      <w:numFmt w:val="decimal"/>
+      <w:lvlText w:val="%4."/>
+      <w:lvlJc w:val="left"/>
+      <w:pPr>
+        <w:ind w:left="2880" w:hanging="360"/>
+      </w:pPr>
+    </w:lvl>
+    <w:lvl w:ilvl="4" w:tplc="40090019" w:tentative="1">
+      <w:start w:val="1"/>
+      <w:numFmt w:val="lowerLetter"/>
+      <w:lvlText w:val="%5."/>
+      <w:lvlJc w:val="left"/>
+      <w:pPr>
+        <w:ind w:left="3600" w:hanging="360"/>
+      </w:pPr>
+    </w:lvl>
+    <w:lvl w:ilvl="5" w:tplc="4009001B" w:tentative="1">
+      <w:start w:val="1"/>
+      <w:numFmt w:val="lowerRoman"/>
+      <w:lvlText w:val="%6."/>
+      <w:lvlJc w:val="right"/>
+      <w:pPr>
+        <w:ind w:left="4320" w:hanging="180"/>
+      </w:pPr>
+    </w:lvl>
+    <w:lvl w:ilvl="6" w:tplc="4009000F" w:tentative="1">
+      <w:start w:val="1"/>
+      <w:numFmt w:val="decimal"/>
+      <w:lvlText w:val="%7."/>
+      <w:lvlJc w:val="left"/>
+      <w:pPr>
+        <w:ind w:left="5040" w:hanging="360"/>
+      </w:pPr>
+    </w:lvl>
+    <w:lvl w:ilvl="7" w:tplc="40090019" w:tentative="1">
+      <w:start w:val="1"/>
+      <w:numFmt w:val="lowerLetter"/>
+      <w:lvlText w:val="%8."/>
+      <w:lvlJc w:val="left"/>
+      <w:pPr>
+        <w:ind w:left="5760" w:hanging="360"/>
+      </w:pPr>
+    </w:lvl>
+    <w:lvl w:ilvl="8" w:tplc="4009001B" w:tentative="1">
+      <w:start w:val="1"/>
+      <w:numFmt w:val="lowerRoman"/>
+      <w:lvlText w:val="%9."/>
+      <w:lvlJc w:val="right"/>
+      <w:pPr>
+        <w:ind w:left="6480" w:hanging="180"/>
+      </w:pPr>
+    </w:lvl>
+  </w:abstractNum>
+  <w:num w:numId="1" w16cid:durableId="190382537">
+    <w:abstractNumId w:val="1"/>
+  </w:num>
+  <w:num w:numId="2" w16cid:durableId="1877693553">
+    <w:abstractNumId w:val="0"/>
+  </w:num>
+</w:numbering>
 </file>
 
 <file path=word/styles.xml><?xml version="1.0" encoding="utf-8"?>
@@ -819,7 +3947,6 @@
   <w:style w:type="character" w:default="1" w:styleId="DefaultParagraphFont">
     <w:name w:val="Default Paragraph Font"/>
     <w:uiPriority w:val="1"/>
-    <w:semiHidden/>
     <w:unhideWhenUsed/>
   </w:style>
   <w:style w:type="table" w:default="1" w:styleId="TableNormal">
@@ -1185,6 +4312,29 @@
       <w:rFonts w:cs="Mangal"/>
     </w:rPr>
   </w:style>
+  <w:style w:type="character" w:styleId="Hyperlink">
+    <w:name w:val="Hyperlink"/>
+    <w:basedOn w:val="DefaultParagraphFont"/>
+    <w:uiPriority w:val="99"/>
+    <w:unhideWhenUsed/>
+    <w:rsid w:val="00653800"/>
+    <w:rPr>
+      <w:color w:val="0563C1" w:themeColor="hyperlink"/>
+      <w:u w:val="single"/>
+    </w:rPr>
+  </w:style>
+  <w:style w:type="character" w:styleId="UnresolvedMention">
+    <w:name w:val="Unresolved Mention"/>
+    <w:basedOn w:val="DefaultParagraphFont"/>
+    <w:uiPriority w:val="99"/>
+    <w:semiHidden/>
+    <w:unhideWhenUsed/>
+    <w:rsid w:val="00653800"/>
+    <w:rPr>
+      <w:color w:val="605E5C"/>
+      <w:shd w:val="clear" w:color="auto" w:fill="E1DFDD"/>
+    </w:rPr>
+  </w:style>
 </w:styles>
 </file>
 

</xml_diff>